<commit_message>
sync doubao: 2026-09-15 18:00
</commit_message>
<xml_diff>
--- a/doubao/skills/word/assets/templates/official-letter-template.docx
+++ b/doubao/skills/word/assets/templates/official-letter-template.docx
@@ -1,408 +1,290 @@
 
 <file path=word/document.xml><?xml version="1.0" encoding="utf-8"?>
-<w:document xmlns:wpc="http://schemas.microsoft.com/office/word/2010/wordprocessingCanvas" xmlns:cx="http://schemas.microsoft.com/office/drawing/2014/chartex" xmlns:cx1="http://schemas.microsoft.com/office/drawing/2015/9/8/chartex" xmlns:cx2="http://schemas.microsoft.com/office/drawing/2015/10/21/chartex" xmlns:cx3="http://schemas.microsoft.com/office/drawing/2016/5/9/chartex" xmlns:cx4="http://schemas.microsoft.com/office/drawing/2016/5/10/chartex" xmlns:cx5="http://schemas.microsoft.com/office/drawing/2016/5/11/chartex" xmlns:cx6="http://schemas.microsoft.com/office/drawing/2016/5/12/chartex" xmlns:cx7="http://schemas.microsoft.com/office/drawing/2016/5/13/chartex" xmlns:cx8="http://schemas.microsoft.com/office/drawing/2016/5/14/chartex" xmlns:mc="http://schemas.openxmlformats.org/markup-compatibility/2006" xmlns:m="http://schemas.openxmlformats.org/officeDocument/2006/math" xmlns:aink="http://schemas.microsoft.com/office/drawing/2016/ink" xmlns:am3d="http://schemas.microsoft.com/office/drawing/2017/model3d" xmlns:oel="http://schemas.microsoft.com/office/2019/extlst" xmlns:r="http://schemas.openxmlformats.org/officeDocument/2006/relationships" xmlns:wp14="http://schemas.microsoft.com/office/word/2010/wordprocessingDrawing" xmlns:wp="http://schemas.openxmlformats.org/drawingml/2006/wordprocessingDrawing" xmlns:wpg="http://schemas.microsoft.com/office/word/2010/wordprocessingGroup" xmlns:wpi="http://schemas.microsoft.com/office/word/2010/wordprocessingInk" xmlns:wps="http://schemas.microsoft.com/office/word/2010/wordprocessingShape" xmlns:o="urn:schemas-microsoft-com:office:office" xmlns:v="urn:schemas-microsoft-com:vml" xmlns:w10="urn:schemas-microsoft-com:office:word" xmlns:w="http://schemas.openxmlformats.org/wordprocessingml/2006/main" xmlns:w14="http://schemas.microsoft.com/office/word/2010/wordml" xmlns:w15="http://schemas.microsoft.com/office/word/2012/wordml" xmlns:w16cex="http://schemas.microsoft.com/office/word/2018/wordml/cex" xmlns:w16cid="http://schemas.microsoft.com/office/word/2016/wordml/cid" xmlns:w16="http://schemas.microsoft.com/office/word/2018/wordml" xmlns:w16sdtdh="http://schemas.microsoft.com/office/word/2020/wordml/sdtdatahash" xmlns:w16sdtfl="http://schemas.microsoft.com/office/word/2024/wordml/sdtformatlock" xmlns:w16se="http://schemas.microsoft.com/office/word/2015/wordml/symex" xmlns:w16du="http://schemas.microsoft.com/office/word/2023/wordml/word16du" xmlns:wne="http://schemas.microsoft.com/office/word/2006/wordml" mc:Ignorable="w14 w15 w16se w16cid w16 w16cex w16sdtdh w16sdtfl w16du wp14">
+<w:document xmlns:wpc="http://schemas.microsoft.com/office/word/2010/wordprocessingCanvas" xmlns:cx="http://schemas.microsoft.com/office/drawing/2014/chartex" xmlns:cx1="http://schemas.microsoft.com/office/drawing/2015/9/8/chartex" xmlns:cx2="http://schemas.microsoft.com/office/drawing/2015/10/21/chartex" xmlns:cx3="http://schemas.microsoft.com/office/drawing/2016/5/9/chartex" xmlns:cx4="http://schemas.microsoft.com/office/drawing/2016/5/10/chartex" xmlns:cx5="http://schemas.microsoft.com/office/drawing/2016/5/11/chartex" xmlns:cx6="http://schemas.microsoft.com/office/drawing/2016/5/12/chartex" xmlns:cx7="http://schemas.microsoft.com/office/drawing/2016/5/13/chartex" xmlns:cx8="http://schemas.microsoft.com/office/drawing/2016/5/14/chartex" xmlns:mc="http://schemas.openxmlformats.org/markup-compatibility/2006" xmlns:m="http://schemas.openxmlformats.org/officeDocument/2006/math" xmlns:aink="http://schemas.microsoft.com/office/drawing/2016/ink" xmlns:am3d="http://schemas.microsoft.com/office/drawing/2017/model3d" xmlns:oel="http://schemas.microsoft.com/office/2019/extlst" xmlns:r="http://schemas.openxmlformats.org/officeDocument/2006/relationships" xmlns:wp14="http://schemas.microsoft.com/office/word/2010/wordprocessingDrawing" xmlns:wp="http://schemas.openxmlformats.org/drawingml/2006/wordprocessingDrawing" xmlns:wpg="http://schemas.microsoft.com/office/word/2010/wordprocessingGroup" xmlns:wpi="http://schemas.microsoft.com/office/word/2010/wordprocessingInk" xmlns:wps="http://schemas.microsoft.com/office/word/2010/wordprocessingShape" xmlns:w="http://schemas.openxmlformats.org/wordprocessingml/2006/main" xmlns:w14="http://schemas.microsoft.com/office/word/2010/wordml" xmlns:w15="http://schemas.microsoft.com/office/word/2012/wordml" xmlns:w16cex="http://schemas.microsoft.com/office/word/2018/wordml/cex" xmlns:w16cid="http://schemas.microsoft.com/office/word/2016/wordml/cid" xmlns:w16="http://schemas.microsoft.com/office/word/2018/wordml" xmlns:w16sdtdh="http://schemas.microsoft.com/office/word/2020/wordml/sdtdatahash" xmlns:w16sdtfl="http://schemas.microsoft.com/office/word/2024/wordml/sdtformatlock" xmlns:w16se="http://schemas.microsoft.com/office/word/2015/wordml/symex" xmlns:w16du="http://schemas.microsoft.com/office/word/2023/wordml/word16du" xmlns:wne="http://schemas.microsoft.com/office/word/2006/wordml" mc:Ignorable="w14 w15 w16se w16cid w16 w16cex w16sdtdh w16sdtfl w16du wp14">
   <w:body>
     <w:p>
       <w:pPr>
+        <w:pStyle w:val="a8"/>
         <w:widowControl w:val="0"/>
         <w:tabs>
           <w:tab w:val="right" w:pos="8844"/>
         </w:tabs>
         <w:snapToGrid w:val="0"/>
-        <w:spacing w:before="731"/>
+        <w:spacing w:before="120"/>
+        <w:ind w:firstLine="0"/>
         <w:jc w:val="right"/>
-        <w:rPr>
-          <w:lang w:eastAsia="zh-CN"/>
-        </w:rPr>
       </w:pPr>
       <w:r>
-        <w:rPr>
-          <w:rFonts w:ascii="Times New Roman" w:hAnsi="Times New Roman" w:cs="Times New Roman"/>
-          <w:color w:val="000000"/>
-          <w:spacing w:val="-4"/>
-          <w:lang w:val="zh-CN"/>
-        </w:rPr>
         <w:tab/>
       </w:r>
       <w:r>
-        <w:rPr>
-          <w:rFonts w:ascii="Times New Roman" w:hAnsi="Times New Roman" w:cs="Times New Roman"/>
-          <w:color w:val="000000"/>
-          <w:spacing w:val="-4"/>
-          <w:lang w:val="zh-CN" w:eastAsia="zh-CN"/>
-        </w:rPr>
         <w:t>〔机关代字〕〔</w:t>
       </w:r>
       <w:r>
-        <w:rPr>
-          <w:rFonts w:ascii="Times New Roman" w:hAnsi="Times New Roman" w:cs="Times New Roman"/>
-          <w:color w:val="000000"/>
-          <w:spacing w:val="-4"/>
-          <w:lang w:val="zh-CN" w:eastAsia="zh-CN"/>
-        </w:rPr>
         <w:t>20XX</w:t>
       </w:r>
       <w:r>
-        <w:rPr>
-          <w:rFonts w:ascii="Times New Roman" w:hAnsi="Times New Roman" w:cs="Times New Roman"/>
-          <w:color w:val="000000"/>
-          <w:spacing w:val="-4"/>
-          <w:lang w:val="zh-CN" w:eastAsia="zh-CN"/>
-        </w:rPr>
         <w:t>〕</w:t>
       </w:r>
       <w:r>
-        <w:rPr>
-          <w:rFonts w:ascii="Times New Roman" w:hAnsi="Times New Roman" w:cs="Times New Roman"/>
-          <w:color w:val="000000"/>
-          <w:spacing w:val="-4"/>
-          <w:lang w:val="zh-CN" w:eastAsia="zh-CN"/>
-        </w:rPr>
         <w:t>X</w:t>
       </w:r>
       <w:r>
-        <w:rPr>
-          <w:rFonts w:ascii="Times New Roman" w:hAnsi="Times New Roman" w:cs="Times New Roman"/>
-          <w:color w:val="000000"/>
-          <w:spacing w:val="-4"/>
-          <w:lang w:val="zh-CN" w:eastAsia="zh-CN"/>
-        </w:rPr>
         <w:t>号</w:t>
       </w:r>
     </w:p>
     <w:p>
       <w:pPr>
+        <w:pStyle w:val="a8"/>
         <w:widowControl w:val="0"/>
-        <w:rPr>
-          <w:lang w:eastAsia="zh-CN"/>
-        </w:rPr>
+        <w:ind w:firstLine="0"/>
       </w:pPr>
     </w:p>
     <w:p>
       <w:pPr>
+        <w:pStyle w:val="af2"/>
         <w:widowControl w:val="0"/>
-        <w:jc w:val="center"/>
-        <w:rPr>
-          <w:rFonts w:ascii="宋体-简" w:eastAsia="宋体-简" w:hAnsi="宋体-简"/>
-          <w:lang w:eastAsia="zh-CN"/>
-        </w:rPr>
       </w:pPr>
       <w:r>
-        <w:rPr>
-          <w:rFonts w:ascii="宋体-简" w:eastAsia="宋体-简" w:hAnsi="宋体-简" w:cs="Times New Roman" w:hint="eastAsia"/>
-          <w:color w:val="000000"/>
-          <w:sz w:val="44"/>
-          <w:lang w:val="zh-CN" w:eastAsia="zh-CN"/>
-        </w:rPr>
         <w:t>关于〔事项〕的函</w:t>
       </w:r>
     </w:p>
     <w:p>
       <w:pPr>
+        <w:pStyle w:val="a8"/>
         <w:widowControl w:val="0"/>
-        <w:rPr>
-          <w:lang w:eastAsia="zh-CN"/>
-        </w:rPr>
+        <w:ind w:firstLine="0"/>
       </w:pPr>
     </w:p>
     <w:p>
       <w:pPr>
+        <w:pStyle w:val="a8"/>
         <w:widowControl w:val="0"/>
-        <w:rPr>
-          <w:lang w:eastAsia="zh-CN"/>
-        </w:rPr>
+        <w:ind w:firstLine="0"/>
       </w:pPr>
       <w:r>
-        <w:rPr>
-          <w:rFonts w:ascii="Times New Roman" w:hAnsi="Times New Roman" w:cs="Times New Roman"/>
-          <w:color w:val="000000"/>
-          <w:spacing w:val="-4"/>
-          <w:lang w:val="zh-CN" w:eastAsia="zh-CN"/>
-        </w:rPr>
         <w:t>〔主送机关〕：</w:t>
       </w:r>
     </w:p>
     <w:p>
       <w:pPr>
+        <w:pStyle w:val="a8"/>
         <w:widowControl w:val="0"/>
-        <w:ind w:firstLine="640"/>
-        <w:rPr>
-          <w:lang w:eastAsia="zh-CN"/>
-        </w:rPr>
       </w:pPr>
       <w:r>
-        <w:rPr>
-          <w:rFonts w:ascii="Times New Roman" w:hAnsi="Times New Roman" w:cs="Times New Roman"/>
-          <w:color w:val="000000"/>
-          <w:spacing w:val="-4"/>
-          <w:lang w:val="zh-CN" w:eastAsia="zh-CN"/>
-        </w:rPr>
         <w:t>〔正文第一段。每个自然段左空二字，回行顶格。〕</w:t>
       </w:r>
     </w:p>
     <w:p>
       <w:pPr>
+        <w:pStyle w:val="1"/>
         <w:widowControl w:val="0"/>
-        <w:ind w:firstLine="640"/>
-        <w:rPr>
-          <w:lang w:eastAsia="zh-CN"/>
-        </w:rPr>
       </w:pPr>
       <w:r>
-        <w:rPr>
-          <w:rFonts w:ascii="Times New Roman" w:eastAsia="SimHei" w:hAnsi="Times New Roman" w:cs="Times New Roman"/>
-          <w:color w:val="000000"/>
-          <w:spacing w:val="-4"/>
-          <w:lang w:val="zh-CN" w:eastAsia="zh-CN"/>
-        </w:rPr>
         <w:t>一、〔一级标题〕</w:t>
+      </w:r>
+      <w:r>
+        <w:t>（</w:t>
+      </w:r>
+      <w:r>
+        <w:t>独立标题行</w:t>
+      </w:r>
+      <w:r>
+        <w:t>，</w:t>
+      </w:r>
+      <w:r>
+        <w:t>按需取用</w:t>
+      </w:r>
+      <w:r>
+        <w:t>）</w:t>
       </w:r>
     </w:p>
     <w:p>
       <w:pPr>
+        <w:pStyle w:val="a8"/>
         <w:widowControl w:val="0"/>
-        <w:ind w:firstLine="640"/>
-        <w:rPr>
-          <w:lang w:eastAsia="zh-CN"/>
-        </w:rPr>
       </w:pPr>
       <w:r>
-        <w:rPr>
-          <w:rFonts w:ascii="Times New Roman" w:hAnsi="Times New Roman" w:cs="Times New Roman"/>
-          <w:color w:val="000000"/>
-          <w:spacing w:val="-4"/>
-          <w:lang w:val="zh-CN" w:eastAsia="zh-CN"/>
-        </w:rPr>
         <w:t>〔一级标题下的正文内容。〕</w:t>
       </w:r>
     </w:p>
     <w:p>
       <w:pPr>
+        <w:pStyle w:val="1"/>
         <w:widowControl w:val="0"/>
-        <w:ind w:firstLine="640"/>
-        <w:rPr>
-          <w:lang w:eastAsia="zh-CN"/>
-        </w:rPr>
       </w:pPr>
       <w:r>
-        <w:rPr>
-          <w:rFonts w:ascii="Times New Roman" w:eastAsia="楷体" w:hAnsi="Times New Roman" w:cs="Times New Roman"/>
-          <w:color w:val="000000"/>
-          <w:spacing w:val="-4"/>
-          <w:lang w:val="zh-CN" w:eastAsia="zh-CN"/>
-        </w:rPr>
-        <w:t>（一）〔二级标题〕</w:t>
+        <w:t>二</w:t>
+      </w:r>
+      <w:r>
+        <w:t>、〔一级标题〕</w:t>
+      </w:r>
+      <w:r>
+        <w:t>（独立标题</w:t>
+      </w:r>
+      <w:r>
+        <w:t>行，按需取用</w:t>
+      </w:r>
+      <w:r>
+        <w:t>）</w:t>
       </w:r>
     </w:p>
     <w:p>
       <w:pPr>
-        <w:keepNext/>
+        <w:pStyle w:val="a8"/>
         <w:widowControl w:val="0"/>
-        <w:ind w:firstLine="640"/>
-        <w:rPr>
-          <w:lang w:eastAsia="zh-CN"/>
-        </w:rPr>
       </w:pPr>
       <w:r>
-        <w:rPr>
-          <w:rFonts w:ascii="Times New Roman" w:hAnsi="Times New Roman" w:cs="Times New Roman"/>
-          <w:color w:val="000000"/>
-          <w:spacing w:val="-4"/>
-          <w:lang w:val="zh-CN" w:eastAsia="zh-CN"/>
-        </w:rPr>
+        <w:t>〔一级标题下的正文内容。〕</w:t>
+      </w:r>
+    </w:p>
+    <w:p>
+      <w:pPr>
+        <w:pStyle w:val="21"/>
+        <w:widowControl w:val="0"/>
+      </w:pPr>
+      <w:r>
+        <w:t>（一）〔二级标题〕</w:t>
+      </w:r>
+      <w:r>
+        <w:t>（如无可整行删除）</w:t>
+      </w:r>
+    </w:p>
+    <w:p>
+      <w:pPr>
+        <w:pStyle w:val="a8"/>
+        <w:widowControl w:val="0"/>
+      </w:pPr>
+      <w:r>
         <w:t>〔二级标题下的正文内容。〕</w:t>
       </w:r>
     </w:p>
     <w:p>
       <w:pPr>
-        <w:keepNext/>
+        <w:pStyle w:val="21"/>
         <w:widowControl w:val="0"/>
-        <w:rPr>
-          <w:lang w:eastAsia="zh-CN"/>
-        </w:rPr>
+      </w:pPr>
+      <w:r>
+        <w:t>（</w:t>
+      </w:r>
+      <w:r>
+        <w:t>二</w:t>
+      </w:r>
+      <w:r>
+        <w:t>）〔二级标题〕</w:t>
+      </w:r>
+      <w:r>
+        <w:t>（如无可整行删除）</w:t>
+      </w:r>
+    </w:p>
+    <w:p>
+      <w:pPr>
+        <w:pStyle w:val="a8"/>
+        <w:widowControl w:val="0"/>
+      </w:pPr>
+      <w:r>
+        <w:t>〔二级标题下的正文内容。〕</w:t>
+      </w:r>
+    </w:p>
+    <w:p>
+      <w:pPr>
+        <w:pStyle w:val="a8"/>
+        <w:widowControl w:val="0"/>
       </w:pPr>
     </w:p>
     <w:p>
       <w:pPr>
+        <w:pStyle w:val="a8"/>
         <w:keepNext/>
         <w:widowControl w:val="0"/>
         <w:ind w:left="2240" w:hanging="1600"/>
-        <w:rPr>
-          <w:lang w:eastAsia="zh-CN"/>
-        </w:rPr>
       </w:pPr>
       <w:r>
-        <w:rPr>
-          <w:rFonts w:ascii="Times New Roman" w:hAnsi="Times New Roman" w:cs="Times New Roman"/>
-          <w:color w:val="000000"/>
-          <w:spacing w:val="-4"/>
-          <w:lang w:val="zh-CN" w:eastAsia="zh-CN"/>
-        </w:rPr>
         <w:t>附件：</w:t>
       </w:r>
       <w:r>
-        <w:rPr>
-          <w:rFonts w:ascii="Times New Roman" w:hAnsi="Times New Roman" w:cs="Times New Roman"/>
-          <w:color w:val="000000"/>
-          <w:spacing w:val="-4"/>
-          <w:lang w:val="zh-CN" w:eastAsia="zh-CN"/>
-        </w:rPr>
         <w:t>1.</w:t>
       </w:r>
       <w:r>
-        <w:rPr>
-          <w:rFonts w:ascii="Times New Roman" w:hAnsi="Times New Roman" w:cs="Times New Roman"/>
-          <w:color w:val="000000"/>
-          <w:spacing w:val="-4"/>
-          <w:lang w:val="zh-CN" w:eastAsia="zh-CN"/>
-        </w:rPr>
         <w:t>〔附件名称〕</w:t>
+      </w:r>
+      <w:r>
+        <w:t>（</w:t>
+      </w:r>
+      <w:r>
+        <w:t>如无可整行删除</w:t>
+      </w:r>
+      <w:r>
+        <w:t>）</w:t>
       </w:r>
     </w:p>
     <w:p>
       <w:pPr>
+        <w:pStyle w:val="a8"/>
         <w:keepNext/>
         <w:widowControl w:val="0"/>
-        <w:rPr>
-          <w:lang w:eastAsia="zh-CN"/>
-        </w:rPr>
+        <w:ind w:firstLine="0"/>
       </w:pPr>
     </w:p>
     <w:p>
       <w:pPr>
+        <w:pStyle w:val="a8"/>
         <w:keepNext/>
         <w:widowControl w:val="0"/>
-        <w:ind w:right="640"/>
+        <w:ind w:right="640" w:firstLine="0"/>
         <w:jc w:val="right"/>
-        <w:rPr>
-          <w:lang w:eastAsia="zh-CN"/>
-        </w:rPr>
       </w:pPr>
       <w:r>
-        <w:rPr>
-          <w:rFonts w:ascii="Times New Roman" w:hAnsi="Times New Roman" w:cs="Times New Roman"/>
-          <w:color w:val="000000"/>
-          <w:spacing w:val="-4"/>
-          <w:lang w:val="zh-CN" w:eastAsia="zh-CN"/>
-        </w:rPr>
         <w:t>〔发文机关署名〕</w:t>
       </w:r>
     </w:p>
     <w:p>
       <w:pPr>
+        <w:pStyle w:val="a8"/>
+        <w:keepNext/>
         <w:keepLines/>
         <w:widowControl w:val="0"/>
-        <w:ind w:right="160"/>
+        <w:ind w:right="160" w:firstLine="0"/>
         <w:jc w:val="right"/>
-        <w:rPr>
-          <w:lang w:eastAsia="zh-CN"/>
-        </w:rPr>
       </w:pPr>
       <w:r>
-        <w:rPr>
-          <w:rFonts w:ascii="Times New Roman" w:hAnsi="Times New Roman" w:cs="Times New Roman"/>
-          <w:color w:val="000000"/>
-          <w:spacing w:val="-4"/>
-          <w:lang w:val="zh-CN" w:eastAsia="zh-CN"/>
-        </w:rPr>
         <w:t>20XX</w:t>
       </w:r>
       <w:r>
-        <w:rPr>
-          <w:rFonts w:ascii="Times New Roman" w:hAnsi="Times New Roman" w:cs="Times New Roman"/>
-          <w:color w:val="000000"/>
-          <w:spacing w:val="-4"/>
-          <w:lang w:val="zh-CN" w:eastAsia="zh-CN"/>
-        </w:rPr>
         <w:t>年</w:t>
       </w:r>
       <w:r>
-        <w:rPr>
-          <w:rFonts w:ascii="Times New Roman" w:hAnsi="Times New Roman" w:cs="Times New Roman"/>
-          <w:color w:val="000000"/>
-          <w:spacing w:val="-4"/>
-          <w:lang w:val="zh-CN" w:eastAsia="zh-CN"/>
-        </w:rPr>
         <w:t>X</w:t>
       </w:r>
       <w:r>
-        <w:rPr>
-          <w:rFonts w:ascii="Times New Roman" w:hAnsi="Times New Roman" w:cs="Times New Roman"/>
-          <w:color w:val="000000"/>
-          <w:spacing w:val="-4"/>
-          <w:lang w:val="zh-CN" w:eastAsia="zh-CN"/>
-        </w:rPr>
         <w:t>月</w:t>
       </w:r>
       <w:r>
-        <w:rPr>
-          <w:rFonts w:ascii="Times New Roman" w:hAnsi="Times New Roman" w:cs="Times New Roman"/>
-          <w:color w:val="000000"/>
-          <w:spacing w:val="-4"/>
-          <w:lang w:val="zh-CN" w:eastAsia="zh-CN"/>
-        </w:rPr>
         <w:t>X</w:t>
       </w:r>
       <w:r>
-        <w:rPr>
-          <w:rFonts w:ascii="Times New Roman" w:hAnsi="Times New Roman" w:cs="Times New Roman"/>
-          <w:color w:val="000000"/>
-          <w:spacing w:val="-4"/>
-          <w:lang w:val="zh-CN" w:eastAsia="zh-CN"/>
-        </w:rPr>
         <w:t>日</w:t>
       </w:r>
     </w:p>
     <w:p>
       <w:pPr>
-        <w:widowControl w:val="0"/>
-        <w:rPr>
-          <w:lang w:eastAsia="zh-CN"/>
-        </w:rPr>
+        <w:pStyle w:val="LetterCopyTo"/>
+        <w:framePr w:w="8845" w:hRule="auto" w:wrap="notBeside" w:vAnchor="margin" w:hAnchor="margin" w:xAlign="left" w:yAlign="bottom" w:hSpace="0" w:vSpace="120"/>
       </w:pPr>
+      <w:r>
+        <w:t>抄送：〔抄送机关〕</w:t>
+      </w:r>
+      <w:r>
+        <w:t>（如无可整行删除）</w:t>
+      </w:r>
+      <w:r>
+        <w:t>。</w:t>
+      </w:r>
     </w:p>
     <w:p>
       <w:pPr>
-        <w:widowControl w:val="0"/>
-        <w:rPr>
-          <w:lang w:eastAsia="zh-CN"/>
-        </w:rPr>
+        <w:pStyle w:val="LetterEndAnchor"/>
       </w:pPr>
-    </w:p>
-    <w:p>
-      <w:pPr>
-        <w:widowControl w:val="0"/>
-        <w:rPr>
-          <w:lang w:eastAsia="zh-CN"/>
-        </w:rPr>
-      </w:pPr>
-    </w:p>
-    <w:p>
-      <w:pPr>
-        <w:widowControl w:val="0"/>
-        <w:rPr>
-          <w:lang w:eastAsia="zh-CN"/>
-        </w:rPr>
-      </w:pPr>
-    </w:p>
-    <w:p>
-      <w:pPr>
-        <w:widowControl w:val="0"/>
-        <w:ind w:left="280" w:right="280"/>
-        <w:rPr>
-          <w:lang w:eastAsia="zh-CN"/>
-        </w:rPr>
-      </w:pPr>
-      <w:r>
-        <w:rPr>
-          <w:rFonts w:ascii="Times New Roman" w:hAnsi="Times New Roman" w:cs="Times New Roman"/>
-          <w:color w:val="000000"/>
-          <w:sz w:val="28"/>
-          <w:lang w:val="zh-CN" w:eastAsia="zh-CN"/>
-        </w:rPr>
-        <w:lastRenderedPageBreak/>
-        <w:t>抄送：〔抄送机关〕。</w:t>
-      </w:r>
     </w:p>
     <w:sectPr>
       <w:headerReference w:type="even" r:id="rId8"/>
@@ -422,7 +304,7 @@
 </file>
 
 <file path=word/endnotes.xml><?xml version="1.0" encoding="utf-8"?>
-<w:endnotes xmlns:wpc="http://schemas.microsoft.com/office/word/2010/wordprocessingCanvas" xmlns:cx="http://schemas.microsoft.com/office/drawing/2014/chartex" xmlns:cx1="http://schemas.microsoft.com/office/drawing/2015/9/8/chartex" xmlns:cx2="http://schemas.microsoft.com/office/drawing/2015/10/21/chartex" xmlns:cx3="http://schemas.microsoft.com/office/drawing/2016/5/9/chartex" xmlns:cx4="http://schemas.microsoft.com/office/drawing/2016/5/10/chartex" xmlns:cx5="http://schemas.microsoft.com/office/drawing/2016/5/11/chartex" xmlns:cx6="http://schemas.microsoft.com/office/drawing/2016/5/12/chartex" xmlns:cx7="http://schemas.microsoft.com/office/drawing/2016/5/13/chartex" xmlns:cx8="http://schemas.microsoft.com/office/drawing/2016/5/14/chartex" xmlns:mc="http://schemas.openxmlformats.org/markup-compatibility/2006" xmlns:m="http://schemas.openxmlformats.org/officeDocument/2006/math" xmlns:aink="http://schemas.microsoft.com/office/drawing/2016/ink" xmlns:am3d="http://schemas.microsoft.com/office/drawing/2017/model3d" xmlns:oel="http://schemas.microsoft.com/office/2019/extlst" xmlns:r="http://schemas.openxmlformats.org/officeDocument/2006/relationships" xmlns:wp14="http://schemas.microsoft.com/office/word/2010/wordprocessingDrawing" xmlns:wp="http://schemas.openxmlformats.org/drawingml/2006/wordprocessingDrawing" xmlns:wpg="http://schemas.microsoft.com/office/word/2010/wordprocessingGroup" xmlns:wpi="http://schemas.microsoft.com/office/word/2010/wordprocessingInk" xmlns:wps="http://schemas.microsoft.com/office/word/2010/wordprocessingShape" xmlns:o="urn:schemas-microsoft-com:office:office" xmlns:v="urn:schemas-microsoft-com:vml" xmlns:w10="urn:schemas-microsoft-com:office:word" xmlns:w="http://schemas.openxmlformats.org/wordprocessingml/2006/main" xmlns:w14="http://schemas.microsoft.com/office/word/2010/wordml" xmlns:w15="http://schemas.microsoft.com/office/word/2012/wordml" xmlns:w16cex="http://schemas.microsoft.com/office/word/2018/wordml/cex" xmlns:w16cid="http://schemas.microsoft.com/office/word/2016/wordml/cid" xmlns:w16="http://schemas.microsoft.com/office/word/2018/wordml" xmlns:w16sdtdh="http://schemas.microsoft.com/office/word/2020/wordml/sdtdatahash" xmlns:w16sdtfl="http://schemas.microsoft.com/office/word/2024/wordml/sdtformatlock" xmlns:w16se="http://schemas.microsoft.com/office/word/2015/wordml/symex" xmlns:w16du="http://schemas.microsoft.com/office/word/2023/wordml/word16du" xmlns:wne="http://schemas.microsoft.com/office/word/2006/wordml" mc:Ignorable="w14 w15 w16se w16cid w16 w16cex w16sdtdh w16sdtfl w16du wp14">
+<w:endnotes xmlns:wpc="http://schemas.microsoft.com/office/word/2010/wordprocessingCanvas" xmlns:cx="http://schemas.microsoft.com/office/drawing/2014/chartex" xmlns:cx1="http://schemas.microsoft.com/office/drawing/2015/9/8/chartex" xmlns:cx2="http://schemas.microsoft.com/office/drawing/2015/10/21/chartex" xmlns:cx3="http://schemas.microsoft.com/office/drawing/2016/5/9/chartex" xmlns:cx4="http://schemas.microsoft.com/office/drawing/2016/5/10/chartex" xmlns:cx5="http://schemas.microsoft.com/office/drawing/2016/5/11/chartex" xmlns:cx6="http://schemas.microsoft.com/office/drawing/2016/5/12/chartex" xmlns:cx7="http://schemas.microsoft.com/office/drawing/2016/5/13/chartex" xmlns:cx8="http://schemas.microsoft.com/office/drawing/2016/5/14/chartex" xmlns:mc="http://schemas.openxmlformats.org/markup-compatibility/2006" xmlns:m="http://schemas.openxmlformats.org/officeDocument/2006/math" xmlns:aink="http://schemas.microsoft.com/office/drawing/2016/ink" xmlns:am3d="http://schemas.microsoft.com/office/drawing/2017/model3d" xmlns:oel="http://schemas.microsoft.com/office/2019/extlst" xmlns:r="http://schemas.openxmlformats.org/officeDocument/2006/relationships" xmlns:wp14="http://schemas.microsoft.com/office/word/2010/wordprocessingDrawing" xmlns:wp="http://schemas.openxmlformats.org/drawingml/2006/wordprocessingDrawing" xmlns:wpg="http://schemas.microsoft.com/office/word/2010/wordprocessingGroup" xmlns:wpi="http://schemas.microsoft.com/office/word/2010/wordprocessingInk" xmlns:wps="http://schemas.microsoft.com/office/word/2010/wordprocessingShape" xmlns:w="http://schemas.openxmlformats.org/wordprocessingml/2006/main" xmlns:w14="http://schemas.microsoft.com/office/word/2010/wordml" xmlns:w15="http://schemas.microsoft.com/office/word/2012/wordml" xmlns:w16cex="http://schemas.microsoft.com/office/word/2018/wordml/cex" xmlns:w16cid="http://schemas.microsoft.com/office/word/2016/wordml/cid" xmlns:w16="http://schemas.microsoft.com/office/word/2018/wordml" xmlns:w16sdtdh="http://schemas.microsoft.com/office/word/2020/wordml/sdtdatahash" xmlns:w16sdtfl="http://schemas.microsoft.com/office/word/2024/wordml/sdtformatlock" xmlns:w16se="http://schemas.microsoft.com/office/word/2015/wordml/symex" xmlns:w16du="http://schemas.microsoft.com/office/word/2023/wordml/word16du" xmlns:wne="http://schemas.microsoft.com/office/word/2006/wordml" mc:Ignorable="w14 w15 w16se w16cid w16 w16cex w16sdtdh w16sdtfl w16du wp14">
   <w:endnote w:type="separator" w:id="-1">
     <w:p>
       <w:pPr>
@@ -447,7 +329,7 @@
 </file>
 
 <file path=word/footer1.xml><?xml version="1.0" encoding="utf-8"?>
-<w:ftr xmlns:wpc="http://schemas.microsoft.com/office/word/2010/wordprocessingCanvas" xmlns:cx="http://schemas.microsoft.com/office/drawing/2014/chartex" xmlns:cx1="http://schemas.microsoft.com/office/drawing/2015/9/8/chartex" xmlns:cx2="http://schemas.microsoft.com/office/drawing/2015/10/21/chartex" xmlns:cx3="http://schemas.microsoft.com/office/drawing/2016/5/9/chartex" xmlns:cx4="http://schemas.microsoft.com/office/drawing/2016/5/10/chartex" xmlns:cx5="http://schemas.microsoft.com/office/drawing/2016/5/11/chartex" xmlns:cx6="http://schemas.microsoft.com/office/drawing/2016/5/12/chartex" xmlns:cx7="http://schemas.microsoft.com/office/drawing/2016/5/13/chartex" xmlns:cx8="http://schemas.microsoft.com/office/drawing/2016/5/14/chartex" xmlns:mc="http://schemas.openxmlformats.org/markup-compatibility/2006" xmlns:m="http://schemas.openxmlformats.org/officeDocument/2006/math" xmlns:aink="http://schemas.microsoft.com/office/drawing/2016/ink" xmlns:am3d="http://schemas.microsoft.com/office/drawing/2017/model3d" xmlns:oel="http://schemas.microsoft.com/office/2019/extlst" xmlns:r="http://schemas.openxmlformats.org/officeDocument/2006/relationships" xmlns:wp14="http://schemas.microsoft.com/office/word/2010/wordprocessingDrawing" xmlns:wp="http://schemas.openxmlformats.org/drawingml/2006/wordprocessingDrawing" xmlns:wpg="http://schemas.microsoft.com/office/word/2010/wordprocessingGroup" xmlns:wpi="http://schemas.microsoft.com/office/word/2010/wordprocessingInk" xmlns:wps="http://schemas.microsoft.com/office/word/2010/wordprocessingShape" xmlns:o="urn:schemas-microsoft-com:office:office" xmlns:v="urn:schemas-microsoft-com:vml" xmlns:w10="urn:schemas-microsoft-com:office:word" xmlns:w="http://schemas.openxmlformats.org/wordprocessingml/2006/main" xmlns:w14="http://schemas.microsoft.com/office/word/2010/wordml" xmlns:w15="http://schemas.microsoft.com/office/word/2012/wordml" xmlns:w16cex="http://schemas.microsoft.com/office/word/2018/wordml/cex" xmlns:w16cid="http://schemas.microsoft.com/office/word/2016/wordml/cid" xmlns:w16="http://schemas.microsoft.com/office/word/2018/wordml" xmlns:w16sdtdh="http://schemas.microsoft.com/office/word/2020/wordml/sdtdatahash" xmlns:w16sdtfl="http://schemas.microsoft.com/office/word/2024/wordml/sdtformatlock" xmlns:w16se="http://schemas.microsoft.com/office/word/2015/wordml/symex" xmlns:w16du="http://schemas.microsoft.com/office/word/2023/wordml/word16du" xmlns:wne="http://schemas.microsoft.com/office/word/2006/wordml" mc:Ignorable="w14 w15 w16se w16cid w16 w16cex w16sdtdh w16sdtfl w16du wp14">
+<w:ftr xmlns:wpc="http://schemas.microsoft.com/office/word/2010/wordprocessingCanvas" xmlns:cx="http://schemas.microsoft.com/office/drawing/2014/chartex" xmlns:cx1="http://schemas.microsoft.com/office/drawing/2015/9/8/chartex" xmlns:cx2="http://schemas.microsoft.com/office/drawing/2015/10/21/chartex" xmlns:cx3="http://schemas.microsoft.com/office/drawing/2016/5/9/chartex" xmlns:cx4="http://schemas.microsoft.com/office/drawing/2016/5/10/chartex" xmlns:cx5="http://schemas.microsoft.com/office/drawing/2016/5/11/chartex" xmlns:cx6="http://schemas.microsoft.com/office/drawing/2016/5/12/chartex" xmlns:cx7="http://schemas.microsoft.com/office/drawing/2016/5/13/chartex" xmlns:cx8="http://schemas.microsoft.com/office/drawing/2016/5/14/chartex" xmlns:mc="http://schemas.openxmlformats.org/markup-compatibility/2006" xmlns:m="http://schemas.openxmlformats.org/officeDocument/2006/math" xmlns:aink="http://schemas.microsoft.com/office/drawing/2016/ink" xmlns:am3d="http://schemas.microsoft.com/office/drawing/2017/model3d" xmlns:oel="http://schemas.microsoft.com/office/2019/extlst" xmlns:r="http://schemas.openxmlformats.org/officeDocument/2006/relationships" xmlns:wp14="http://schemas.microsoft.com/office/word/2010/wordprocessingDrawing" xmlns:wp="http://schemas.openxmlformats.org/drawingml/2006/wordprocessingDrawing" xmlns:wpg="http://schemas.microsoft.com/office/word/2010/wordprocessingGroup" xmlns:wpi="http://schemas.microsoft.com/office/word/2010/wordprocessingInk" xmlns:wps="http://schemas.microsoft.com/office/word/2010/wordprocessingShape" xmlns:w="http://schemas.openxmlformats.org/wordprocessingml/2006/main" xmlns:w14="http://schemas.microsoft.com/office/word/2010/wordml" xmlns:w15="http://schemas.microsoft.com/office/word/2012/wordml" xmlns:w16cex="http://schemas.microsoft.com/office/word/2018/wordml/cex" xmlns:w16cid="http://schemas.microsoft.com/office/word/2016/wordml/cid" xmlns:w16="http://schemas.microsoft.com/office/word/2018/wordml" xmlns:w16sdtdh="http://schemas.microsoft.com/office/word/2020/wordml/sdtdatahash" xmlns:w16sdtfl="http://schemas.microsoft.com/office/word/2024/wordml/sdtformatlock" xmlns:w16se="http://schemas.microsoft.com/office/word/2015/wordml/symex" xmlns:w16du="http://schemas.microsoft.com/office/word/2023/wordml/word16du" xmlns:wne="http://schemas.microsoft.com/office/word/2006/wordml" mc:Ignorable="w14 w15 w16se w16cid w16 w16cex w16sdtdh w16sdtfl w16du wp14">
   <w:p>
     <w:pPr>
       <w:widowControl w:val="0"/>
@@ -526,13 +408,17 @@
       </w:pBdr>
       <w:spacing w:line="60" w:lineRule="exact"/>
       <w:ind w:left="-454" w:right="-340"/>
+      <w:rPr>
+        <w:sz w:val="2"/>
+        <w:szCs w:val="2"/>
+      </w:rPr>
     </w:pPr>
   </w:p>
 </w:ftr>
 </file>
 
 <file path=word/footer2.xml><?xml version="1.0" encoding="utf-8"?>
-<w:ftr xmlns:wpc="http://schemas.microsoft.com/office/word/2010/wordprocessingCanvas" xmlns:cx="http://schemas.microsoft.com/office/drawing/2014/chartex" xmlns:cx1="http://schemas.microsoft.com/office/drawing/2015/9/8/chartex" xmlns:cx2="http://schemas.microsoft.com/office/drawing/2015/10/21/chartex" xmlns:cx3="http://schemas.microsoft.com/office/drawing/2016/5/9/chartex" xmlns:cx4="http://schemas.microsoft.com/office/drawing/2016/5/10/chartex" xmlns:cx5="http://schemas.microsoft.com/office/drawing/2016/5/11/chartex" xmlns:cx6="http://schemas.microsoft.com/office/drawing/2016/5/12/chartex" xmlns:cx7="http://schemas.microsoft.com/office/drawing/2016/5/13/chartex" xmlns:cx8="http://schemas.microsoft.com/office/drawing/2016/5/14/chartex" xmlns:mc="http://schemas.openxmlformats.org/markup-compatibility/2006" xmlns:m="http://schemas.openxmlformats.org/officeDocument/2006/math" xmlns:aink="http://schemas.microsoft.com/office/drawing/2016/ink" xmlns:am3d="http://schemas.microsoft.com/office/drawing/2017/model3d" xmlns:oel="http://schemas.microsoft.com/office/2019/extlst" xmlns:r="http://schemas.openxmlformats.org/officeDocument/2006/relationships" xmlns:wp14="http://schemas.microsoft.com/office/word/2010/wordprocessingDrawing" xmlns:wp="http://schemas.openxmlformats.org/drawingml/2006/wordprocessingDrawing" xmlns:wpg="http://schemas.microsoft.com/office/word/2010/wordprocessingGroup" xmlns:wpi="http://schemas.microsoft.com/office/word/2010/wordprocessingInk" xmlns:wps="http://schemas.microsoft.com/office/word/2010/wordprocessingShape" xmlns:o="urn:schemas-microsoft-com:office:office" xmlns:v="urn:schemas-microsoft-com:vml" xmlns:w10="urn:schemas-microsoft-com:office:word" xmlns:w="http://schemas.openxmlformats.org/wordprocessingml/2006/main" xmlns:w14="http://schemas.microsoft.com/office/word/2010/wordml" xmlns:w15="http://schemas.microsoft.com/office/word/2012/wordml" xmlns:w16cex="http://schemas.microsoft.com/office/word/2018/wordml/cex" xmlns:w16cid="http://schemas.microsoft.com/office/word/2016/wordml/cid" xmlns:w16="http://schemas.microsoft.com/office/word/2018/wordml" xmlns:w16sdtdh="http://schemas.microsoft.com/office/word/2020/wordml/sdtdatahash" xmlns:w16sdtfl="http://schemas.microsoft.com/office/word/2024/wordml/sdtformatlock" xmlns:w16se="http://schemas.microsoft.com/office/word/2015/wordml/symex" xmlns:w16du="http://schemas.microsoft.com/office/word/2023/wordml/word16du" xmlns:wne="http://schemas.microsoft.com/office/word/2006/wordml" mc:Ignorable="w14 w15 w16se w16cid w16 w16cex w16sdtdh w16sdtfl w16du wp14">
+<w:ftr xmlns:wpc="http://schemas.microsoft.com/office/word/2010/wordprocessingCanvas" xmlns:cx="http://schemas.microsoft.com/office/drawing/2014/chartex" xmlns:cx1="http://schemas.microsoft.com/office/drawing/2015/9/8/chartex" xmlns:cx2="http://schemas.microsoft.com/office/drawing/2015/10/21/chartex" xmlns:cx3="http://schemas.microsoft.com/office/drawing/2016/5/9/chartex" xmlns:cx4="http://schemas.microsoft.com/office/drawing/2016/5/10/chartex" xmlns:cx5="http://schemas.microsoft.com/office/drawing/2016/5/11/chartex" xmlns:cx6="http://schemas.microsoft.com/office/drawing/2016/5/12/chartex" xmlns:cx7="http://schemas.microsoft.com/office/drawing/2016/5/13/chartex" xmlns:cx8="http://schemas.microsoft.com/office/drawing/2016/5/14/chartex" xmlns:mc="http://schemas.openxmlformats.org/markup-compatibility/2006" xmlns:m="http://schemas.openxmlformats.org/officeDocument/2006/math" xmlns:aink="http://schemas.microsoft.com/office/drawing/2016/ink" xmlns:am3d="http://schemas.microsoft.com/office/drawing/2017/model3d" xmlns:oel="http://schemas.microsoft.com/office/2019/extlst" xmlns:r="http://schemas.openxmlformats.org/officeDocument/2006/relationships" xmlns:wp14="http://schemas.microsoft.com/office/word/2010/wordprocessingDrawing" xmlns:wp="http://schemas.openxmlformats.org/drawingml/2006/wordprocessingDrawing" xmlns:wpg="http://schemas.microsoft.com/office/word/2010/wordprocessingGroup" xmlns:wpi="http://schemas.microsoft.com/office/word/2010/wordprocessingInk" xmlns:wps="http://schemas.microsoft.com/office/word/2010/wordprocessingShape" xmlns:w="http://schemas.openxmlformats.org/wordprocessingml/2006/main" xmlns:w14="http://schemas.microsoft.com/office/word/2010/wordml" xmlns:w15="http://schemas.microsoft.com/office/word/2012/wordml" xmlns:w16cex="http://schemas.microsoft.com/office/word/2018/wordml/cex" xmlns:w16cid="http://schemas.microsoft.com/office/word/2016/wordml/cid" xmlns:w16="http://schemas.microsoft.com/office/word/2018/wordml" xmlns:w16sdtdh="http://schemas.microsoft.com/office/word/2020/wordml/sdtdatahash" xmlns:w16sdtfl="http://schemas.microsoft.com/office/word/2024/wordml/sdtformatlock" xmlns:w16se="http://schemas.microsoft.com/office/word/2015/wordml/symex" xmlns:w16du="http://schemas.microsoft.com/office/word/2023/wordml/word16du" xmlns:wne="http://schemas.microsoft.com/office/word/2006/wordml" mc:Ignorable="w14 w15 w16se w16cid w16 w16cex w16sdtdh w16sdtfl w16du wp14">
   <w:p>
     <w:pPr>
       <w:widowControl w:val="0"/>
@@ -582,7 +468,7 @@
         <w:sz w:val="28"/>
         <w:lang w:val="zh-CN"/>
       </w:rPr>
-      <w:t>2</w:t>
+      <w:t>3</w:t>
     </w:r>
     <w:r>
       <w:rPr>
@@ -612,13 +498,17 @@
       </w:pBdr>
       <w:spacing w:line="60" w:lineRule="exact"/>
       <w:ind w:left="-454" w:right="-340"/>
+      <w:rPr>
+        <w:sz w:val="2"/>
+        <w:szCs w:val="2"/>
+      </w:rPr>
     </w:pPr>
   </w:p>
 </w:ftr>
 </file>
 
 <file path=word/footer3.xml><?xml version="1.0" encoding="utf-8"?>
-<w:ftr xmlns:wpc="http://schemas.microsoft.com/office/word/2010/wordprocessingCanvas" xmlns:cx="http://schemas.microsoft.com/office/drawing/2014/chartex" xmlns:cx1="http://schemas.microsoft.com/office/drawing/2015/9/8/chartex" xmlns:cx2="http://schemas.microsoft.com/office/drawing/2015/10/21/chartex" xmlns:cx3="http://schemas.microsoft.com/office/drawing/2016/5/9/chartex" xmlns:cx4="http://schemas.microsoft.com/office/drawing/2016/5/10/chartex" xmlns:cx5="http://schemas.microsoft.com/office/drawing/2016/5/11/chartex" xmlns:cx6="http://schemas.microsoft.com/office/drawing/2016/5/12/chartex" xmlns:cx7="http://schemas.microsoft.com/office/drawing/2016/5/13/chartex" xmlns:cx8="http://schemas.microsoft.com/office/drawing/2016/5/14/chartex" xmlns:mc="http://schemas.openxmlformats.org/markup-compatibility/2006" xmlns:m="http://schemas.openxmlformats.org/officeDocument/2006/math" xmlns:aink="http://schemas.microsoft.com/office/drawing/2016/ink" xmlns:am3d="http://schemas.microsoft.com/office/drawing/2017/model3d" xmlns:oel="http://schemas.microsoft.com/office/2019/extlst" xmlns:r="http://schemas.openxmlformats.org/officeDocument/2006/relationships" xmlns:wp14="http://schemas.microsoft.com/office/word/2010/wordprocessingDrawing" xmlns:wp="http://schemas.openxmlformats.org/drawingml/2006/wordprocessingDrawing" xmlns:wpg="http://schemas.microsoft.com/office/word/2010/wordprocessingGroup" xmlns:wpi="http://schemas.microsoft.com/office/word/2010/wordprocessingInk" xmlns:wps="http://schemas.microsoft.com/office/word/2010/wordprocessingShape" xmlns:o="urn:schemas-microsoft-com:office:office" xmlns:v="urn:schemas-microsoft-com:vml" xmlns:w10="urn:schemas-microsoft-com:office:word" xmlns:w="http://schemas.openxmlformats.org/wordprocessingml/2006/main" xmlns:w14="http://schemas.microsoft.com/office/word/2010/wordml" xmlns:w15="http://schemas.microsoft.com/office/word/2012/wordml" xmlns:w16cex="http://schemas.microsoft.com/office/word/2018/wordml/cex" xmlns:w16cid="http://schemas.microsoft.com/office/word/2016/wordml/cid" xmlns:w16="http://schemas.microsoft.com/office/word/2018/wordml" xmlns:w16sdtdh="http://schemas.microsoft.com/office/word/2020/wordml/sdtdatahash" xmlns:w16sdtfl="http://schemas.microsoft.com/office/word/2024/wordml/sdtformatlock" xmlns:w16se="http://schemas.microsoft.com/office/word/2015/wordml/symex" xmlns:w16du="http://schemas.microsoft.com/office/word/2023/wordml/word16du" xmlns:wne="http://schemas.microsoft.com/office/word/2006/wordml" mc:Ignorable="w14 w15 w16se w16cid w16 w16cex w16sdtdh w16sdtfl w16du wp14">
+<w:ftr xmlns:wpc="http://schemas.microsoft.com/office/word/2010/wordprocessingCanvas" xmlns:cx="http://schemas.microsoft.com/office/drawing/2014/chartex" xmlns:cx1="http://schemas.microsoft.com/office/drawing/2015/9/8/chartex" xmlns:cx2="http://schemas.microsoft.com/office/drawing/2015/10/21/chartex" xmlns:cx3="http://schemas.microsoft.com/office/drawing/2016/5/9/chartex" xmlns:cx4="http://schemas.microsoft.com/office/drawing/2016/5/10/chartex" xmlns:cx5="http://schemas.microsoft.com/office/drawing/2016/5/11/chartex" xmlns:cx6="http://schemas.microsoft.com/office/drawing/2016/5/12/chartex" xmlns:cx7="http://schemas.microsoft.com/office/drawing/2016/5/13/chartex" xmlns:cx8="http://schemas.microsoft.com/office/drawing/2016/5/14/chartex" xmlns:mc="http://schemas.openxmlformats.org/markup-compatibility/2006" xmlns:m="http://schemas.openxmlformats.org/officeDocument/2006/math" xmlns:aink="http://schemas.microsoft.com/office/drawing/2016/ink" xmlns:am3d="http://schemas.microsoft.com/office/drawing/2017/model3d" xmlns:oel="http://schemas.microsoft.com/office/2019/extlst" xmlns:r="http://schemas.openxmlformats.org/officeDocument/2006/relationships" xmlns:wp14="http://schemas.microsoft.com/office/word/2010/wordprocessingDrawing" xmlns:wp="http://schemas.openxmlformats.org/drawingml/2006/wordprocessingDrawing" xmlns:wpg="http://schemas.microsoft.com/office/word/2010/wordprocessingGroup" xmlns:wpi="http://schemas.microsoft.com/office/word/2010/wordprocessingInk" xmlns:wps="http://schemas.microsoft.com/office/word/2010/wordprocessingShape" xmlns:w="http://schemas.openxmlformats.org/wordprocessingml/2006/main" xmlns:w14="http://schemas.microsoft.com/office/word/2010/wordml" xmlns:w15="http://schemas.microsoft.com/office/word/2012/wordml" xmlns:w16cex="http://schemas.microsoft.com/office/word/2018/wordml/cex" xmlns:w16cid="http://schemas.microsoft.com/office/word/2016/wordml/cid" xmlns:w16="http://schemas.microsoft.com/office/word/2018/wordml" xmlns:w16sdtdh="http://schemas.microsoft.com/office/word/2020/wordml/sdtdatahash" xmlns:w16sdtfl="http://schemas.microsoft.com/office/word/2024/wordml/sdtformatlock" xmlns:w16se="http://schemas.microsoft.com/office/word/2015/wordml/symex" xmlns:w16du="http://schemas.microsoft.com/office/word/2023/wordml/word16du" xmlns:wne="http://schemas.microsoft.com/office/word/2006/wordml" mc:Ignorable="w14 w15 w16se w16cid w16 w16cex w16sdtdh w16sdtfl w16du wp14">
   <w:p>
     <w:pPr>
       <w:widowControl w:val="0"/>
@@ -633,13 +523,17 @@
       </w:pBdr>
       <w:spacing w:line="60" w:lineRule="exact"/>
       <w:ind w:left="-454" w:right="-340"/>
+      <w:rPr>
+        <w:sz w:val="2"/>
+        <w:szCs w:val="2"/>
+      </w:rPr>
     </w:pPr>
   </w:p>
 </w:ftr>
 </file>
 
 <file path=word/footnotes.xml><?xml version="1.0" encoding="utf-8"?>
-<w:footnotes xmlns:wpc="http://schemas.microsoft.com/office/word/2010/wordprocessingCanvas" xmlns:cx="http://schemas.microsoft.com/office/drawing/2014/chartex" xmlns:cx1="http://schemas.microsoft.com/office/drawing/2015/9/8/chartex" xmlns:cx2="http://schemas.microsoft.com/office/drawing/2015/10/21/chartex" xmlns:cx3="http://schemas.microsoft.com/office/drawing/2016/5/9/chartex" xmlns:cx4="http://schemas.microsoft.com/office/drawing/2016/5/10/chartex" xmlns:cx5="http://schemas.microsoft.com/office/drawing/2016/5/11/chartex" xmlns:cx6="http://schemas.microsoft.com/office/drawing/2016/5/12/chartex" xmlns:cx7="http://schemas.microsoft.com/office/drawing/2016/5/13/chartex" xmlns:cx8="http://schemas.microsoft.com/office/drawing/2016/5/14/chartex" xmlns:mc="http://schemas.openxmlformats.org/markup-compatibility/2006" xmlns:m="http://schemas.openxmlformats.org/officeDocument/2006/math" xmlns:aink="http://schemas.microsoft.com/office/drawing/2016/ink" xmlns:am3d="http://schemas.microsoft.com/office/drawing/2017/model3d" xmlns:oel="http://schemas.microsoft.com/office/2019/extlst" xmlns:r="http://schemas.openxmlformats.org/officeDocument/2006/relationships" xmlns:wp14="http://schemas.microsoft.com/office/word/2010/wordprocessingDrawing" xmlns:wp="http://schemas.openxmlformats.org/drawingml/2006/wordprocessingDrawing" xmlns:wpg="http://schemas.microsoft.com/office/word/2010/wordprocessingGroup" xmlns:wpi="http://schemas.microsoft.com/office/word/2010/wordprocessingInk" xmlns:wps="http://schemas.microsoft.com/office/word/2010/wordprocessingShape" xmlns:o="urn:schemas-microsoft-com:office:office" xmlns:v="urn:schemas-microsoft-com:vml" xmlns:w10="urn:schemas-microsoft-com:office:word" xmlns:w="http://schemas.openxmlformats.org/wordprocessingml/2006/main" xmlns:w14="http://schemas.microsoft.com/office/word/2010/wordml" xmlns:w15="http://schemas.microsoft.com/office/word/2012/wordml" xmlns:w16cex="http://schemas.microsoft.com/office/word/2018/wordml/cex" xmlns:w16cid="http://schemas.microsoft.com/office/word/2016/wordml/cid" xmlns:w16="http://schemas.microsoft.com/office/word/2018/wordml" xmlns:w16sdtdh="http://schemas.microsoft.com/office/word/2020/wordml/sdtdatahash" xmlns:w16sdtfl="http://schemas.microsoft.com/office/word/2024/wordml/sdtformatlock" xmlns:w16se="http://schemas.microsoft.com/office/word/2015/wordml/symex" xmlns:w16du="http://schemas.microsoft.com/office/word/2023/wordml/word16du" xmlns:wne="http://schemas.microsoft.com/office/word/2006/wordml" mc:Ignorable="w14 w15 w16se w16cid w16 w16cex w16sdtdh w16sdtfl w16du wp14">
+<w:footnotes xmlns:wpc="http://schemas.microsoft.com/office/word/2010/wordprocessingCanvas" xmlns:cx="http://schemas.microsoft.com/office/drawing/2014/chartex" xmlns:cx1="http://schemas.microsoft.com/office/drawing/2015/9/8/chartex" xmlns:cx2="http://schemas.microsoft.com/office/drawing/2015/10/21/chartex" xmlns:cx3="http://schemas.microsoft.com/office/drawing/2016/5/9/chartex" xmlns:cx4="http://schemas.microsoft.com/office/drawing/2016/5/10/chartex" xmlns:cx5="http://schemas.microsoft.com/office/drawing/2016/5/11/chartex" xmlns:cx6="http://schemas.microsoft.com/office/drawing/2016/5/12/chartex" xmlns:cx7="http://schemas.microsoft.com/office/drawing/2016/5/13/chartex" xmlns:cx8="http://schemas.microsoft.com/office/drawing/2016/5/14/chartex" xmlns:mc="http://schemas.openxmlformats.org/markup-compatibility/2006" xmlns:m="http://schemas.openxmlformats.org/officeDocument/2006/math" xmlns:aink="http://schemas.microsoft.com/office/drawing/2016/ink" xmlns:am3d="http://schemas.microsoft.com/office/drawing/2017/model3d" xmlns:oel="http://schemas.microsoft.com/office/2019/extlst" xmlns:r="http://schemas.openxmlformats.org/officeDocument/2006/relationships" xmlns:wp14="http://schemas.microsoft.com/office/word/2010/wordprocessingDrawing" xmlns:wp="http://schemas.openxmlformats.org/drawingml/2006/wordprocessingDrawing" xmlns:wpg="http://schemas.microsoft.com/office/word/2010/wordprocessingGroup" xmlns:wpi="http://schemas.microsoft.com/office/word/2010/wordprocessingInk" xmlns:wps="http://schemas.microsoft.com/office/word/2010/wordprocessingShape" xmlns:w="http://schemas.openxmlformats.org/wordprocessingml/2006/main" xmlns:w14="http://schemas.microsoft.com/office/word/2010/wordml" xmlns:w15="http://schemas.microsoft.com/office/word/2012/wordml" xmlns:w16cex="http://schemas.microsoft.com/office/word/2018/wordml/cex" xmlns:w16cid="http://schemas.microsoft.com/office/word/2016/wordml/cid" xmlns:w16="http://schemas.microsoft.com/office/word/2018/wordml" xmlns:w16sdtdh="http://schemas.microsoft.com/office/word/2020/wordml/sdtdatahash" xmlns:w16sdtfl="http://schemas.microsoft.com/office/word/2024/wordml/sdtformatlock" xmlns:w16se="http://schemas.microsoft.com/office/word/2015/wordml/symex" xmlns:w16du="http://schemas.microsoft.com/office/word/2023/wordml/word16du" xmlns:wne="http://schemas.microsoft.com/office/word/2006/wordml" mc:Ignorable="w14 w15 w16se w16cid w16 w16cex w16sdtdh w16sdtfl w16du wp14">
   <w:footnote w:type="separator" w:id="-1">
     <w:p>
       <w:pPr>
@@ -664,13 +558,13 @@
 </file>
 
 <file path=word/header1.xml><?xml version="1.0" encoding="utf-8"?>
-<w:hdr xmlns:wpc="http://schemas.microsoft.com/office/word/2010/wordprocessingCanvas" xmlns:cx="http://schemas.microsoft.com/office/drawing/2014/chartex" xmlns:cx1="http://schemas.microsoft.com/office/drawing/2015/9/8/chartex" xmlns:cx2="http://schemas.microsoft.com/office/drawing/2015/10/21/chartex" xmlns:cx3="http://schemas.microsoft.com/office/drawing/2016/5/9/chartex" xmlns:cx4="http://schemas.microsoft.com/office/drawing/2016/5/10/chartex" xmlns:cx5="http://schemas.microsoft.com/office/drawing/2016/5/11/chartex" xmlns:cx6="http://schemas.microsoft.com/office/drawing/2016/5/12/chartex" xmlns:cx7="http://schemas.microsoft.com/office/drawing/2016/5/13/chartex" xmlns:cx8="http://schemas.microsoft.com/office/drawing/2016/5/14/chartex" xmlns:mc="http://schemas.openxmlformats.org/markup-compatibility/2006" xmlns:m="http://schemas.openxmlformats.org/officeDocument/2006/math" xmlns:aink="http://schemas.microsoft.com/office/drawing/2016/ink" xmlns:am3d="http://schemas.microsoft.com/office/drawing/2017/model3d" xmlns:oel="http://schemas.microsoft.com/office/2019/extlst" xmlns:r="http://schemas.openxmlformats.org/officeDocument/2006/relationships" xmlns:wp14="http://schemas.microsoft.com/office/word/2010/wordprocessingDrawing" xmlns:wp="http://schemas.openxmlformats.org/drawingml/2006/wordprocessingDrawing" xmlns:wpg="http://schemas.microsoft.com/office/word/2010/wordprocessingGroup" xmlns:wpi="http://schemas.microsoft.com/office/word/2010/wordprocessingInk" xmlns:wps="http://schemas.microsoft.com/office/word/2010/wordprocessingShape" xmlns:o="urn:schemas-microsoft-com:office:office" xmlns:v="urn:schemas-microsoft-com:vml" xmlns:w10="urn:schemas-microsoft-com:office:word" xmlns:w="http://schemas.openxmlformats.org/wordprocessingml/2006/main" xmlns:w14="http://schemas.microsoft.com/office/word/2010/wordml" xmlns:w15="http://schemas.microsoft.com/office/word/2012/wordml" xmlns:w16cex="http://schemas.microsoft.com/office/word/2018/wordml/cex" xmlns:w16cid="http://schemas.microsoft.com/office/word/2016/wordml/cid" xmlns:w16="http://schemas.microsoft.com/office/word/2018/wordml" xmlns:w16sdtdh="http://schemas.microsoft.com/office/word/2020/wordml/sdtdatahash" xmlns:w16sdtfl="http://schemas.microsoft.com/office/word/2024/wordml/sdtformatlock" xmlns:w16se="http://schemas.microsoft.com/office/word/2015/wordml/symex" xmlns:w16du="http://schemas.microsoft.com/office/word/2023/wordml/word16du" xmlns:wne="http://schemas.microsoft.com/office/word/2006/wordml" mc:Ignorable="w14 w15 w16se w16cid w16 w16cex w16sdtdh w16sdtfl w16du wp14">
+<w:hdr xmlns:wpc="http://schemas.microsoft.com/office/word/2010/wordprocessingCanvas" xmlns:cx="http://schemas.microsoft.com/office/drawing/2014/chartex" xmlns:cx1="http://schemas.microsoft.com/office/drawing/2015/9/8/chartex" xmlns:cx2="http://schemas.microsoft.com/office/drawing/2015/10/21/chartex" xmlns:cx3="http://schemas.microsoft.com/office/drawing/2016/5/9/chartex" xmlns:cx4="http://schemas.microsoft.com/office/drawing/2016/5/10/chartex" xmlns:cx5="http://schemas.microsoft.com/office/drawing/2016/5/11/chartex" xmlns:cx6="http://schemas.microsoft.com/office/drawing/2016/5/12/chartex" xmlns:cx7="http://schemas.microsoft.com/office/drawing/2016/5/13/chartex" xmlns:cx8="http://schemas.microsoft.com/office/drawing/2016/5/14/chartex" xmlns:mc="http://schemas.openxmlformats.org/markup-compatibility/2006" xmlns:m="http://schemas.openxmlformats.org/officeDocument/2006/math" xmlns:aink="http://schemas.microsoft.com/office/drawing/2016/ink" xmlns:am3d="http://schemas.microsoft.com/office/drawing/2017/model3d" xmlns:oel="http://schemas.microsoft.com/office/2019/extlst" xmlns:r="http://schemas.openxmlformats.org/officeDocument/2006/relationships" xmlns:wp14="http://schemas.microsoft.com/office/word/2010/wordprocessingDrawing" xmlns:wp="http://schemas.openxmlformats.org/drawingml/2006/wordprocessingDrawing" xmlns:wpg="http://schemas.microsoft.com/office/word/2010/wordprocessingGroup" xmlns:wpi="http://schemas.microsoft.com/office/word/2010/wordprocessingInk" xmlns:wps="http://schemas.microsoft.com/office/word/2010/wordprocessingShape" xmlns:w="http://schemas.openxmlformats.org/wordprocessingml/2006/main" xmlns:w14="http://schemas.microsoft.com/office/word/2010/wordml" xmlns:w15="http://schemas.microsoft.com/office/word/2012/wordml" xmlns:w16cex="http://schemas.microsoft.com/office/word/2018/wordml/cex" xmlns:w16cid="http://schemas.microsoft.com/office/word/2016/wordml/cid" xmlns:w16="http://schemas.microsoft.com/office/word/2018/wordml" xmlns:w16sdtdh="http://schemas.microsoft.com/office/word/2020/wordml/sdtdatahash" xmlns:w16sdtfl="http://schemas.microsoft.com/office/word/2024/wordml/sdtformatlock" xmlns:w16se="http://schemas.microsoft.com/office/word/2015/wordml/symex" xmlns:w16du="http://schemas.microsoft.com/office/word/2023/wordml/word16du" xmlns:wne="http://schemas.microsoft.com/office/word/2006/wordml" mc:Ignorable="w14 w15 w16se w16cid w16 w16cex w16sdtdh w16sdtfl w16du wp14">
   <w:p/>
 </w:hdr>
 </file>
 
 <file path=word/header2.xml><?xml version="1.0" encoding="utf-8"?>
-<w:hdr xmlns:wpc="http://schemas.microsoft.com/office/word/2010/wordprocessingCanvas" xmlns:cx="http://schemas.microsoft.com/office/drawing/2014/chartex" xmlns:cx1="http://schemas.microsoft.com/office/drawing/2015/9/8/chartex" xmlns:cx2="http://schemas.microsoft.com/office/drawing/2015/10/21/chartex" xmlns:cx3="http://schemas.microsoft.com/office/drawing/2016/5/9/chartex" xmlns:cx4="http://schemas.microsoft.com/office/drawing/2016/5/10/chartex" xmlns:cx5="http://schemas.microsoft.com/office/drawing/2016/5/11/chartex" xmlns:cx6="http://schemas.microsoft.com/office/drawing/2016/5/12/chartex" xmlns:cx7="http://schemas.microsoft.com/office/drawing/2016/5/13/chartex" xmlns:cx8="http://schemas.microsoft.com/office/drawing/2016/5/14/chartex" xmlns:mc="http://schemas.openxmlformats.org/markup-compatibility/2006" xmlns:m="http://schemas.openxmlformats.org/officeDocument/2006/math" xmlns:aink="http://schemas.microsoft.com/office/drawing/2016/ink" xmlns:am3d="http://schemas.microsoft.com/office/drawing/2017/model3d" xmlns:oel="http://schemas.microsoft.com/office/2019/extlst" xmlns:r="http://schemas.openxmlformats.org/officeDocument/2006/relationships" xmlns:wp14="http://schemas.microsoft.com/office/word/2010/wordprocessingDrawing" xmlns:wp="http://schemas.openxmlformats.org/drawingml/2006/wordprocessingDrawing" xmlns:wpg="http://schemas.microsoft.com/office/word/2010/wordprocessingGroup" xmlns:wpi="http://schemas.microsoft.com/office/word/2010/wordprocessingInk" xmlns:wps="http://schemas.microsoft.com/office/word/2010/wordprocessingShape" xmlns:o="urn:schemas-microsoft-com:office:office" xmlns:v="urn:schemas-microsoft-com:vml" xmlns:w10="urn:schemas-microsoft-com:office:word" xmlns:w="http://schemas.openxmlformats.org/wordprocessingml/2006/main" xmlns:w14="http://schemas.microsoft.com/office/word/2010/wordml" xmlns:w15="http://schemas.microsoft.com/office/word/2012/wordml" xmlns:w16cex="http://schemas.microsoft.com/office/word/2018/wordml/cex" xmlns:w16cid="http://schemas.microsoft.com/office/word/2016/wordml/cid" xmlns:w16="http://schemas.microsoft.com/office/word/2018/wordml" xmlns:w16sdtdh="http://schemas.microsoft.com/office/word/2020/wordml/sdtdatahash" xmlns:w16sdtfl="http://schemas.microsoft.com/office/word/2024/wordml/sdtformatlock" xmlns:w16se="http://schemas.microsoft.com/office/word/2015/wordml/symex" xmlns:w16du="http://schemas.microsoft.com/office/word/2023/wordml/word16du" xmlns:wne="http://schemas.microsoft.com/office/word/2006/wordml" mc:Ignorable="w14 w15 w16se w16cid w16 w16cex w16sdtdh w16sdtfl w16du wp14">
+<w:hdr xmlns:wpc="http://schemas.microsoft.com/office/word/2010/wordprocessingCanvas" xmlns:cx="http://schemas.microsoft.com/office/drawing/2014/chartex" xmlns:cx1="http://schemas.microsoft.com/office/drawing/2015/9/8/chartex" xmlns:cx2="http://schemas.microsoft.com/office/drawing/2015/10/21/chartex" xmlns:cx3="http://schemas.microsoft.com/office/drawing/2016/5/9/chartex" xmlns:cx4="http://schemas.microsoft.com/office/drawing/2016/5/10/chartex" xmlns:cx5="http://schemas.microsoft.com/office/drawing/2016/5/11/chartex" xmlns:cx6="http://schemas.microsoft.com/office/drawing/2016/5/12/chartex" xmlns:cx7="http://schemas.microsoft.com/office/drawing/2016/5/13/chartex" xmlns:cx8="http://schemas.microsoft.com/office/drawing/2016/5/14/chartex" xmlns:mc="http://schemas.openxmlformats.org/markup-compatibility/2006" xmlns:m="http://schemas.openxmlformats.org/officeDocument/2006/math" xmlns:aink="http://schemas.microsoft.com/office/drawing/2016/ink" xmlns:am3d="http://schemas.microsoft.com/office/drawing/2017/model3d" xmlns:oel="http://schemas.microsoft.com/office/2019/extlst" xmlns:r="http://schemas.openxmlformats.org/officeDocument/2006/relationships" xmlns:wp14="http://schemas.microsoft.com/office/word/2010/wordprocessingDrawing" xmlns:wp="http://schemas.openxmlformats.org/drawingml/2006/wordprocessingDrawing" xmlns:wpg="http://schemas.microsoft.com/office/word/2010/wordprocessingGroup" xmlns:wpi="http://schemas.microsoft.com/office/word/2010/wordprocessingInk" xmlns:wps="http://schemas.microsoft.com/office/word/2010/wordprocessingShape" xmlns:w="http://schemas.openxmlformats.org/wordprocessingml/2006/main" xmlns:w14="http://schemas.microsoft.com/office/word/2010/wordml" xmlns:w15="http://schemas.microsoft.com/office/word/2012/wordml" xmlns:w16cex="http://schemas.microsoft.com/office/word/2018/wordml/cex" xmlns:w16cid="http://schemas.microsoft.com/office/word/2016/wordml/cid" xmlns:w16="http://schemas.microsoft.com/office/word/2018/wordml" xmlns:w16sdtdh="http://schemas.microsoft.com/office/word/2020/wordml/sdtdatahash" xmlns:w16sdtfl="http://schemas.microsoft.com/office/word/2024/wordml/sdtformatlock" xmlns:w16se="http://schemas.microsoft.com/office/word/2015/wordml/symex" xmlns:w16du="http://schemas.microsoft.com/office/word/2023/wordml/word16du" xmlns:wne="http://schemas.microsoft.com/office/word/2006/wordml" mc:Ignorable="w14 w15 w16se w16cid w16 w16cex w16sdtdh w16sdtfl w16du wp14">
   <w:p>
     <w:pPr>
       <w:pStyle w:val="ad"/>
@@ -730,7 +624,7 @@
 </file>
 
 <file path=word/header3.xml><?xml version="1.0" encoding="utf-8"?>
-<w:hdr xmlns:wpc="http://schemas.microsoft.com/office/word/2010/wordprocessingCanvas" xmlns:cx="http://schemas.microsoft.com/office/drawing/2014/chartex" xmlns:cx1="http://schemas.microsoft.com/office/drawing/2015/9/8/chartex" xmlns:cx2="http://schemas.microsoft.com/office/drawing/2015/10/21/chartex" xmlns:cx3="http://schemas.microsoft.com/office/drawing/2016/5/9/chartex" xmlns:cx4="http://schemas.microsoft.com/office/drawing/2016/5/10/chartex" xmlns:cx5="http://schemas.microsoft.com/office/drawing/2016/5/11/chartex" xmlns:cx6="http://schemas.microsoft.com/office/drawing/2016/5/12/chartex" xmlns:cx7="http://schemas.microsoft.com/office/drawing/2016/5/13/chartex" xmlns:cx8="http://schemas.microsoft.com/office/drawing/2016/5/14/chartex" xmlns:mc="http://schemas.openxmlformats.org/markup-compatibility/2006" xmlns:m="http://schemas.openxmlformats.org/officeDocument/2006/math" xmlns:aink="http://schemas.microsoft.com/office/drawing/2016/ink" xmlns:am3d="http://schemas.microsoft.com/office/drawing/2017/model3d" xmlns:oel="http://schemas.microsoft.com/office/2019/extlst" xmlns:r="http://schemas.openxmlformats.org/officeDocument/2006/relationships" xmlns:wp14="http://schemas.microsoft.com/office/word/2010/wordprocessingDrawing" xmlns:wp="http://schemas.openxmlformats.org/drawingml/2006/wordprocessingDrawing" xmlns:wpg="http://schemas.microsoft.com/office/word/2010/wordprocessingGroup" xmlns:wpi="http://schemas.microsoft.com/office/word/2010/wordprocessingInk" xmlns:wps="http://schemas.microsoft.com/office/word/2010/wordprocessingShape" xmlns:o="urn:schemas-microsoft-com:office:office" xmlns:v="urn:schemas-microsoft-com:vml" xmlns:w10="urn:schemas-microsoft-com:office:word" xmlns:w="http://schemas.openxmlformats.org/wordprocessingml/2006/main" xmlns:w14="http://schemas.microsoft.com/office/word/2010/wordml" xmlns:w15="http://schemas.microsoft.com/office/word/2012/wordml" xmlns:w16cex="http://schemas.microsoft.com/office/word/2018/wordml/cex" xmlns:w16cid="http://schemas.microsoft.com/office/word/2016/wordml/cid" xmlns:w16="http://schemas.microsoft.com/office/word/2018/wordml" xmlns:w16sdtdh="http://schemas.microsoft.com/office/word/2020/wordml/sdtdatahash" xmlns:w16sdtfl="http://schemas.microsoft.com/office/word/2024/wordml/sdtformatlock" xmlns:w16se="http://schemas.microsoft.com/office/word/2015/wordml/symex" xmlns:w16du="http://schemas.microsoft.com/office/word/2023/wordml/word16du" xmlns:wne="http://schemas.microsoft.com/office/word/2006/wordml" mc:Ignorable="w14 w15 w16se w16cid w16 w16cex w16sdtdh w16sdtfl w16du wp14">
+<w:hdr xmlns:wpc="http://schemas.microsoft.com/office/word/2010/wordprocessingCanvas" xmlns:cx="http://schemas.microsoft.com/office/drawing/2014/chartex" xmlns:cx1="http://schemas.microsoft.com/office/drawing/2015/9/8/chartex" xmlns:cx2="http://schemas.microsoft.com/office/drawing/2015/10/21/chartex" xmlns:cx3="http://schemas.microsoft.com/office/drawing/2016/5/9/chartex" xmlns:cx4="http://schemas.microsoft.com/office/drawing/2016/5/10/chartex" xmlns:cx5="http://schemas.microsoft.com/office/drawing/2016/5/11/chartex" xmlns:cx6="http://schemas.microsoft.com/office/drawing/2016/5/12/chartex" xmlns:cx7="http://schemas.microsoft.com/office/drawing/2016/5/13/chartex" xmlns:cx8="http://schemas.microsoft.com/office/drawing/2016/5/14/chartex" xmlns:mc="http://schemas.openxmlformats.org/markup-compatibility/2006" xmlns:m="http://schemas.openxmlformats.org/officeDocument/2006/math" xmlns:aink="http://schemas.microsoft.com/office/drawing/2016/ink" xmlns:am3d="http://schemas.microsoft.com/office/drawing/2017/model3d" xmlns:oel="http://schemas.microsoft.com/office/2019/extlst" xmlns:r="http://schemas.openxmlformats.org/officeDocument/2006/relationships" xmlns:wp14="http://schemas.microsoft.com/office/word/2010/wordprocessingDrawing" xmlns:wp="http://schemas.openxmlformats.org/drawingml/2006/wordprocessingDrawing" xmlns:wpg="http://schemas.microsoft.com/office/word/2010/wordprocessingGroup" xmlns:wpi="http://schemas.microsoft.com/office/word/2010/wordprocessingInk" xmlns:wps="http://schemas.microsoft.com/office/word/2010/wordprocessingShape" xmlns:w="http://schemas.openxmlformats.org/wordprocessingml/2006/main" xmlns:w14="http://schemas.microsoft.com/office/word/2010/wordml" xmlns:w15="http://schemas.microsoft.com/office/word/2012/wordml" xmlns:w16cex="http://schemas.microsoft.com/office/word/2018/wordml/cex" xmlns:w16cid="http://schemas.microsoft.com/office/word/2016/wordml/cid" xmlns:w16="http://schemas.microsoft.com/office/word/2018/wordml" xmlns:w16sdtdh="http://schemas.microsoft.com/office/word/2020/wordml/sdtdatahash" xmlns:w16sdtfl="http://schemas.microsoft.com/office/word/2024/wordml/sdtformatlock" xmlns:w16se="http://schemas.microsoft.com/office/word/2015/wordml/symex" xmlns:w16du="http://schemas.microsoft.com/office/word/2023/wordml/word16du" xmlns:wne="http://schemas.microsoft.com/office/word/2006/wordml" mc:Ignorable="w14 w15 w16se w16cid w16 w16cex w16sdtdh w16sdtfl w16du wp14">
   <w:p>
     <w:pPr>
       <w:widowControl w:val="0"/>
@@ -739,73 +633,97 @@
     <w:r>
       <w:rPr>
         <w:rFonts w:eastAsia="宋体-简" w:cs="Times New Roman"/>
-      </w:rPr>
-      <w:pict w14:anchorId="06685170">
-        <v:shapetype id="_x0000_t202" coordsize="21600,21600" o:spt="202" path="m,l,21600r21600,l21600,xe">
-          <v:stroke joinstyle="miter"/>
-          <v:path gradientshapeok="t" o:connecttype="rect"/>
-        </v:shapetype>
-        <v:shape id="LetterheadAgencyMark" o:spid="_x0000_s1025" type="#_x0000_t202" alt="" style="position:absolute;margin-left:52.25pt;margin-top:88.25pt;width:490.8pt;height:48pt;z-index:251658752;mso-wrap-style:square;mso-wrap-edited:f;mso-width-percent:0;mso-height-percent:0;mso-wrap-distance-top:0;mso-wrap-distance-bottom:0;mso-position-horizontal-relative:page;mso-position-vertical-relative:page;mso-width-percent:0;mso-height-percent:0;mso-width-relative:page;mso-height-relative:page;v-text-anchor:top" filled="f" stroked="f">
-          <v:textbox inset="1.5mm,0,1.5mm,0">
-            <w:txbxContent>
-              <w:p>
-                <w:pPr>
-                  <w:spacing w:line="680" w:lineRule="exact"/>
-                  <w:jc w:val="center"/>
-                  <w:rPr>
-                    <w:rFonts w:ascii="宋体-简" w:eastAsia="宋体-简" w:hAnsi="宋体-简"/>
-                    <w:lang w:eastAsia="zh-CN"/>
-                  </w:rPr>
-                </w:pPr>
-                <w:r>
-                  <w:rPr>
-                    <w:rFonts w:ascii="宋体-简" w:eastAsia="宋体-简" w:hAnsi="宋体-简" w:cs="Times New Roman"/>
-                    <w:color w:val="FF0000"/>
-                    <w:sz w:val="60"/>
-                    <w:szCs w:val="60"/>
-                    <w:lang w:eastAsia="zh-CN"/>
-                  </w:rPr>
-                  <w:t>［发文机关全称或规范化简称］</w:t>
-                </w:r>
-              </w:p>
-              <w:p>
-                <w:pPr>
-                  <w:spacing w:line="159" w:lineRule="exact"/>
-                  <w:rPr>
-                    <w:rFonts w:ascii="宋体-简" w:eastAsia="宋体-简" w:hAnsi="宋体-简"/>
-                    <w:lang w:eastAsia="zh-CN"/>
-                  </w:rPr>
-                </w:pPr>
-              </w:p>
-              <w:p>
-                <w:pPr>
-                  <w:pBdr>
-                    <w:bottom w:val="single" w:sz="12" w:space="0" w:color="FF0000"/>
-                  </w:pBdr>
-                  <w:spacing w:line="20" w:lineRule="exact"/>
-                  <w:rPr>
-                    <w:rFonts w:ascii="宋体-简" w:eastAsia="宋体-简" w:hAnsi="宋体-简"/>
-                    <w:lang w:eastAsia="zh-CN"/>
-                  </w:rPr>
-                </w:pPr>
-              </w:p>
-              <w:p>
-                <w:pPr>
-                  <w:pBdr>
-                    <w:bottom w:val="single" w:sz="4" w:space="0" w:color="FF0000"/>
-                  </w:pBdr>
-                  <w:spacing w:line="10" w:lineRule="exact"/>
-                  <w:rPr>
-                    <w:rFonts w:ascii="宋体-简" w:eastAsia="宋体-简" w:hAnsi="宋体-简"/>
-                    <w:lang w:eastAsia="zh-CN"/>
-                  </w:rPr>
-                </w:pPr>
-              </w:p>
-            </w:txbxContent>
-          </v:textbox>
-          <w10:wrap type="topAndBottom" anchorx="page" anchory="page"/>
-        </v:shape>
-      </w:pict>
+        <w:noProof/>
+      </w:rPr>
+      <mc:AlternateContent>
+        <mc:Choice Requires="wps">
+          <w:drawing>
+            <wp:anchor distT="0" distB="0" distL="114300" distR="114300" simplePos="0" relativeHeight="251658752" behindDoc="0" locked="0" layoutInCell="1" allowOverlap="1" wp14:anchorId="0207E187" wp14:editId="03639ABD">
+              <wp:simplePos x="0" y="0"/>
+              <wp:positionH relativeFrom="page">
+                <wp:posOffset>663575</wp:posOffset>
+              </wp:positionH>
+              <wp:positionV relativeFrom="page">
+                <wp:posOffset>1120775</wp:posOffset>
+              </wp:positionV>
+              <wp:extent cx="6233160" cy="609600"/>
+              <wp:effectExtent l="0" t="0" r="0" b="0"/>
+              <wp:wrapTopAndBottom/>
+              <wp:docPr id="3" name="LetterheadAgencyMark"/>
+              <wp:cNvGraphicFramePr/>
+              <a:graphic xmlns:a="http://schemas.openxmlformats.org/drawingml/2006/main">
+                <a:graphicData uri="http://schemas.microsoft.com/office/word/2010/wordprocessingShape">
+                  <wps:wsp>
+                    <wps:cNvSpPr txBox="1"/>
+                    <wps:spPr>
+                      <a:xfrm>
+                        <a:off x="0" y="0"/>
+                        <a:ext cx="6233160" cy="609600"/>
+                      </a:xfrm>
+                      <a:prstGeom prst="rect">
+                        <a:avLst/>
+                      </a:prstGeom>
+                      <a:noFill/>
+                      <a:ln>
+                        <a:noFill/>
+                      </a:ln>
+                    </wps:spPr>
+                    <wps:txbx>
+                      <w:txbxContent>
+                        <w:p>
+                          <w:pPr>
+                            <w:pStyle w:val="LetterheadAgency"/>
+                          </w:pPr>
+                          <w:r>
+                            <w:t>［发文机关全称或规范化简称］</w:t>
+                          </w:r>
+                        </w:p>
+                        <w:p>
+                          <w:pPr>
+                            <w:spacing w:line="159" w:lineRule="exact"/>
+                            <w:rPr>
+                              <w:rFonts w:ascii="宋体-简" w:eastAsia="宋体-简" w:hAnsi="宋体-简"/>
+                              <w:lang w:eastAsia="zh-CN"/>
+                            </w:rPr>
+                          </w:pPr>
+                        </w:p>
+                        <w:p>
+                          <w:pPr>
+                            <w:pBdr>
+                              <w:bottom w:val="single" w:sz="12" w:space="0" w:color="FF0000"/>
+                            </w:pBdr>
+                            <w:spacing w:line="20" w:lineRule="exact"/>
+                            <w:rPr>
+                              <w:rFonts w:ascii="宋体-简" w:eastAsia="宋体-简" w:hAnsi="宋体-简"/>
+                              <w:lang w:eastAsia="zh-CN"/>
+                            </w:rPr>
+                          </w:pPr>
+                        </w:p>
+                        <w:p>
+                          <w:pPr>
+                            <w:pBdr>
+                              <w:bottom w:val="single" w:sz="4" w:space="0" w:color="FF0000"/>
+                            </w:pBdr>
+                            <w:spacing w:line="10" w:lineRule="exact"/>
+                            <w:rPr>
+                              <w:rFonts w:ascii="宋体-简" w:eastAsia="宋体-简" w:hAnsi="宋体-简"/>
+                              <w:lang w:eastAsia="zh-CN"/>
+                            </w:rPr>
+                          </w:pPr>
+                        </w:p>
+                      </w:txbxContent>
+                    </wps:txbx>
+                    <wps:bodyPr rot="0" vertOverflow="overflow" horzOverflow="overflow" vert="horz" wrap="square" lIns="54000" tIns="0" rIns="54000" bIns="0" anchor="t" anchorCtr="0" upright="1" compatLnSpc="1">
+                      <a:noAutofit/>
+                    </wps:bodyPr>
+                  </wps:wsp>
+                </a:graphicData>
+              </a:graphic>
+            </wp:anchor>
+          </w:drawing>
+        </mc:Choice>
+        <mc:Fallback/>
+      </mc:AlternateContent>
     </w:r>
     <w:r>
       <w:rPr>
@@ -862,7 +780,7 @@
 </file>
 
 <file path=word/numbering.xml><?xml version="1.0" encoding="utf-8"?>
-<w:numbering xmlns:wpc="http://schemas.microsoft.com/office/word/2010/wordprocessingCanvas" xmlns:cx="http://schemas.microsoft.com/office/drawing/2014/chartex" xmlns:cx1="http://schemas.microsoft.com/office/drawing/2015/9/8/chartex" xmlns:cx2="http://schemas.microsoft.com/office/drawing/2015/10/21/chartex" xmlns:cx3="http://schemas.microsoft.com/office/drawing/2016/5/9/chartex" xmlns:cx4="http://schemas.microsoft.com/office/drawing/2016/5/10/chartex" xmlns:cx5="http://schemas.microsoft.com/office/drawing/2016/5/11/chartex" xmlns:cx6="http://schemas.microsoft.com/office/drawing/2016/5/12/chartex" xmlns:cx7="http://schemas.microsoft.com/office/drawing/2016/5/13/chartex" xmlns:cx8="http://schemas.microsoft.com/office/drawing/2016/5/14/chartex" xmlns:mc="http://schemas.openxmlformats.org/markup-compatibility/2006" xmlns:m="http://schemas.openxmlformats.org/officeDocument/2006/math" xmlns:aink="http://schemas.microsoft.com/office/drawing/2016/ink" xmlns:am3d="http://schemas.microsoft.com/office/drawing/2017/model3d" xmlns:oel="http://schemas.microsoft.com/office/2019/extlst" xmlns:r="http://schemas.openxmlformats.org/officeDocument/2006/relationships" xmlns:wp14="http://schemas.microsoft.com/office/word/2010/wordprocessingDrawing" xmlns:wp="http://schemas.openxmlformats.org/drawingml/2006/wordprocessingDrawing" xmlns:wpg="http://schemas.microsoft.com/office/word/2010/wordprocessingGroup" xmlns:wpi="http://schemas.microsoft.com/office/word/2010/wordprocessingInk" xmlns:wps="http://schemas.microsoft.com/office/word/2010/wordprocessingShape" xmlns:o="urn:schemas-microsoft-com:office:office" xmlns:v="urn:schemas-microsoft-com:vml" xmlns:w10="urn:schemas-microsoft-com:office:word" xmlns:w="http://schemas.openxmlformats.org/wordprocessingml/2006/main" xmlns:w14="http://schemas.microsoft.com/office/word/2010/wordml" xmlns:w15="http://schemas.microsoft.com/office/word/2012/wordml" xmlns:w16cex="http://schemas.microsoft.com/office/word/2018/wordml/cex" xmlns:w16cid="http://schemas.microsoft.com/office/word/2016/wordml/cid" xmlns:w16="http://schemas.microsoft.com/office/word/2018/wordml" xmlns:w16sdtdh="http://schemas.microsoft.com/office/word/2020/wordml/sdtdatahash" xmlns:w16sdtfl="http://schemas.microsoft.com/office/word/2024/wordml/sdtformatlock" xmlns:w16se="http://schemas.microsoft.com/office/word/2015/wordml/symex" xmlns:w16du="http://schemas.microsoft.com/office/word/2023/wordml/word16du" xmlns:wne="http://schemas.microsoft.com/office/word/2006/wordml" mc:Ignorable="w14 w15 w16se w16cid w16 w16cex w16sdtdh w16sdtfl w16du wp14">
+<w:numbering xmlns:wpc="http://schemas.microsoft.com/office/word/2010/wordprocessingCanvas" xmlns:cx="http://schemas.microsoft.com/office/drawing/2014/chartex" xmlns:cx1="http://schemas.microsoft.com/office/drawing/2015/9/8/chartex" xmlns:cx2="http://schemas.microsoft.com/office/drawing/2015/10/21/chartex" xmlns:cx3="http://schemas.microsoft.com/office/drawing/2016/5/9/chartex" xmlns:cx4="http://schemas.microsoft.com/office/drawing/2016/5/10/chartex" xmlns:cx5="http://schemas.microsoft.com/office/drawing/2016/5/11/chartex" xmlns:cx6="http://schemas.microsoft.com/office/drawing/2016/5/12/chartex" xmlns:cx7="http://schemas.microsoft.com/office/drawing/2016/5/13/chartex" xmlns:cx8="http://schemas.microsoft.com/office/drawing/2016/5/14/chartex" xmlns:mc="http://schemas.openxmlformats.org/markup-compatibility/2006" xmlns:m="http://schemas.openxmlformats.org/officeDocument/2006/math" xmlns:aink="http://schemas.microsoft.com/office/drawing/2016/ink" xmlns:am3d="http://schemas.microsoft.com/office/drawing/2017/model3d" xmlns:oel="http://schemas.microsoft.com/office/2019/extlst" xmlns:r="http://schemas.openxmlformats.org/officeDocument/2006/relationships" xmlns:wp14="http://schemas.microsoft.com/office/word/2010/wordprocessingDrawing" xmlns:wp="http://schemas.openxmlformats.org/drawingml/2006/wordprocessingDrawing" xmlns:wpg="http://schemas.microsoft.com/office/word/2010/wordprocessingGroup" xmlns:wpi="http://schemas.microsoft.com/office/word/2010/wordprocessingInk" xmlns:wps="http://schemas.microsoft.com/office/word/2010/wordprocessingShape" xmlns:w="http://schemas.openxmlformats.org/wordprocessingml/2006/main" xmlns:w14="http://schemas.microsoft.com/office/word/2010/wordml" xmlns:w15="http://schemas.microsoft.com/office/word/2012/wordml" xmlns:w16cex="http://schemas.microsoft.com/office/word/2018/wordml/cex" xmlns:w16cid="http://schemas.microsoft.com/office/word/2016/wordml/cid" xmlns:w16="http://schemas.microsoft.com/office/word/2018/wordml" xmlns:w16sdtdh="http://schemas.microsoft.com/office/word/2020/wordml/sdtdatahash" xmlns:w16sdtfl="http://schemas.microsoft.com/office/word/2024/wordml/sdtformatlock" xmlns:w16se="http://schemas.microsoft.com/office/word/2015/wordml/symex" xmlns:w16du="http://schemas.microsoft.com/office/word/2023/wordml/word16du" xmlns:wne="http://schemas.microsoft.com/office/word/2006/wordml" mc:Ignorable="w14 w15 w16se w16cid w16 w16cex w16sdtdh w16sdtfl w16du wp14">
   <w:abstractNum w:abstractNumId="0" w15:restartNumberingAfterBreak="0">
     <w:nsid w:val="FFFFFF7E"/>
     <w:multiLevelType w:val="singleLevel"/>
@@ -1390,13 +1308,6 @@
     <w:lsdException w:name="Unresolved Mention" w:semiHidden="1" w:unhideWhenUsed="1"/>
     <w:lsdException w:name="Smart Link" w:semiHidden="1" w:unhideWhenUsed="1"/>
   </w:latentStyles>
-  <w:style w:type="paragraph" w:styleId="Normal" w:default="1">
-    <w:name w:val="Normal"/>
-    <w:qFormat/>
-  </w:style>
-  <w:style w:type="character" w:styleId="DefaultParagraphFont" w:default="1">
-    <w:name w:val="Default Paragraph Font"/>
-  </w:style>
   <w:style w:type="paragraph" w:default="1" w:styleId="a1">
     <w:name w:val="Normal"/>
     <w:qFormat/>
@@ -1412,47 +1323,58 @@
   </w:style>
   <w:style w:type="paragraph" w:styleId="1">
     <w:name w:val="heading 1"/>
-    <w:basedOn w:val="a1"/>
-    <w:next w:val="a1"/>
-    <w:link w:val="10"/>
-    <w:uiPriority w:val="9"/>
+    <w:basedOn w:val="a8"/>
+    <w:next w:val="a8"/>
+    <w:uiPriority w:val="3"/>
     <w:qFormat/>
     <w:pPr>
       <w:keepNext/>
       <w:keepLines/>
-      <w:spacing w:before="480"/>
+      <w:widowControl w:val="0"/>
+      <w:spacing w:before="0" w:after="0" w:line="579" w:lineRule="exact"/>
+      <w:ind w:left="0" w:right="0" w:firstLine="640"/>
+      <w:jc w:val="both"/>
       <w:outlineLvl w:val="0"/>
     </w:pPr>
     <w:rPr>
-      <w:rFonts w:asciiTheme="majorHAnsi" w:eastAsiaTheme="majorEastAsia" w:hAnsiTheme="majorHAnsi" w:cstheme="majorBidi"/>
-      <w:b/>
-      <w:bCs/>
-      <w:color w:val="365F91" w:themeColor="accent1" w:themeShade="BF"/>
-      <w:sz w:val="28"/>
-      <w:szCs w:val="28"/>
+      <w:rFonts w:ascii="Times New Roman" w:hAnsi="Times New Roman" w:eastAsia="黑体" w:cs="Times New Roman"/>
+      <w:b w:val="0"/>
+      <w:bCs w:val="0"/>
+      <w:i w:val="0"/>
+      <w:iCs w:val="0"/>
+      <w:color w:val="000000"/>
+      <w:spacing w:val="-4"/>
+      <w:sz w:val="32"/>
+      <w:szCs w:val="32"/>
+      <w:lang w:val="en-US" w:eastAsia="zh-CN"/>
     </w:rPr>
   </w:style>
   <w:style w:type="paragraph" w:styleId="21">
     <w:name w:val="heading 2"/>
-    <w:basedOn w:val="a1"/>
-    <w:next w:val="a1"/>
-    <w:link w:val="22"/>
-    <w:uiPriority w:val="9"/>
-    <w:unhideWhenUsed/>
+    <w:basedOn w:val="a8"/>
+    <w:next w:val="a8"/>
+    <w:uiPriority w:val="4"/>
     <w:qFormat/>
     <w:pPr>
       <w:keepNext/>
       <w:keepLines/>
-      <w:spacing w:before="200"/>
+      <w:widowControl w:val="0"/>
+      <w:spacing w:before="0" w:after="0" w:line="579" w:lineRule="exact"/>
+      <w:ind w:left="0" w:right="0" w:firstLine="640"/>
+      <w:jc w:val="both"/>
       <w:outlineLvl w:val="1"/>
     </w:pPr>
     <w:rPr>
-      <w:rFonts w:asciiTheme="majorHAnsi" w:eastAsiaTheme="majorEastAsia" w:hAnsiTheme="majorHAnsi" w:cstheme="majorBidi"/>
-      <w:b/>
-      <w:bCs/>
-      <w:color w:val="4F81BD" w:themeColor="accent1"/>
-      <w:sz w:val="26"/>
-      <w:szCs w:val="26"/>
+      <w:rFonts w:ascii="Times New Roman" w:hAnsi="Times New Roman" w:eastAsia="楷体" w:cs="Times New Roman"/>
+      <w:b w:val="0"/>
+      <w:bCs w:val="0"/>
+      <w:i w:val="0"/>
+      <w:iCs w:val="0"/>
+      <w:color w:val="000000"/>
+      <w:spacing w:val="-4"/>
+      <w:sz w:val="32"/>
+      <w:szCs w:val="32"/>
+      <w:lang w:val="en-US" w:eastAsia="zh-CN"/>
     </w:rPr>
   </w:style>
   <w:style w:type="paragraph" w:styleId="31">
@@ -1473,7 +1395,7 @@
       <w:rFonts w:asciiTheme="majorHAnsi" w:eastAsiaTheme="majorEastAsia" w:hAnsiTheme="majorHAnsi" w:cstheme="majorBidi"/>
       <w:b/>
       <w:bCs/>
-      <w:color w:val="4F81BD" w:themeColor="accent1"/>
+      <w:color w:val="000000"/>
     </w:rPr>
   </w:style>
   <w:style w:type="paragraph" w:styleId="4">
@@ -1497,7 +1419,7 @@
       <w:bCs/>
       <w:i/>
       <w:iCs/>
-      <w:color w:val="4F81BD" w:themeColor="accent1"/>
+      <w:color w:val="000000"/>
     </w:rPr>
   </w:style>
   <w:style w:type="paragraph" w:styleId="5">
@@ -1517,7 +1439,7 @@
     </w:pPr>
     <w:rPr>
       <w:rFonts w:asciiTheme="majorHAnsi" w:eastAsiaTheme="majorEastAsia" w:hAnsiTheme="majorHAnsi" w:cstheme="majorBidi"/>
-      <w:color w:val="244061" w:themeColor="accent1" w:themeShade="80"/>
+      <w:color w:val="000000"/>
     </w:rPr>
   </w:style>
   <w:style w:type="paragraph" w:styleId="6">
@@ -1539,7 +1461,7 @@
       <w:rFonts w:asciiTheme="majorHAnsi" w:eastAsiaTheme="majorEastAsia" w:hAnsiTheme="majorHAnsi" w:cstheme="majorBidi"/>
       <w:i/>
       <w:iCs/>
-      <w:color w:val="244061" w:themeColor="accent1" w:themeShade="80"/>
+      <w:color w:val="000000"/>
     </w:rPr>
   </w:style>
   <w:style w:type="paragraph" w:styleId="7">
@@ -1561,7 +1483,7 @@
       <w:rFonts w:asciiTheme="majorHAnsi" w:eastAsiaTheme="majorEastAsia" w:hAnsiTheme="majorHAnsi" w:cstheme="majorBidi"/>
       <w:i/>
       <w:iCs/>
-      <w:color w:val="404040" w:themeColor="text1" w:themeTint="BF"/>
+      <w:color w:val="000000"/>
     </w:rPr>
   </w:style>
   <w:style w:type="paragraph" w:styleId="8">
@@ -1581,7 +1503,7 @@
     </w:pPr>
     <w:rPr>
       <w:rFonts w:asciiTheme="majorHAnsi" w:eastAsiaTheme="majorEastAsia" w:hAnsiTheme="majorHAnsi" w:cstheme="majorBidi"/>
-      <w:color w:val="4F81BD" w:themeColor="accent1"/>
+      <w:color w:val="000000"/>
       <w:sz w:val="20"/>
       <w:szCs w:val="20"/>
     </w:rPr>
@@ -1605,7 +1527,7 @@
       <w:rFonts w:asciiTheme="majorHAnsi" w:eastAsiaTheme="majorEastAsia" w:hAnsiTheme="majorHAnsi" w:cstheme="majorBidi"/>
       <w:i/>
       <w:iCs/>
-      <w:color w:val="404040" w:themeColor="text1" w:themeTint="BF"/>
+      <w:color w:val="000000"/>
       <w:sz w:val="20"/>
       <w:szCs w:val="20"/>
     </w:rPr>
@@ -1753,12 +1675,28 @@
   <w:style w:type="paragraph" w:styleId="a8">
     <w:name w:val="Body Text"/>
     <w:basedOn w:val="a1"/>
-    <w:link w:val="a9"/>
-    <w:uiPriority w:val="99"/>
-    <w:unhideWhenUsed/>
+    <w:next w:val="a8"/>
+    <w:uiPriority w:val="1"/>
+    <w:qFormat/>
     <w:pPr>
-      <w:spacing w:after="120"/>
+      <w:widowControl w:val="0"/>
+      <w:spacing w:before="0" w:after="0" w:line="579" w:lineRule="exact"/>
+      <w:ind w:left="0" w:right="0" w:firstLine="640"/>
+      <w:jc w:val="both"/>
+      <w:outlineLvl w:val="9"/>
     </w:pPr>
+    <w:rPr>
+      <w:rFonts w:ascii="Times New Roman" w:hAnsi="Times New Roman" w:eastAsia="仿宋" w:cs="Times New Roman"/>
+      <w:b w:val="0"/>
+      <w:bCs w:val="0"/>
+      <w:i w:val="0"/>
+      <w:iCs w:val="0"/>
+      <w:color w:val="000000"/>
+      <w:spacing w:val="-4"/>
+      <w:sz w:val="32"/>
+      <w:szCs w:val="32"/>
+      <w:lang w:val="en-US" w:eastAsia="zh-CN"/>
+    </w:rPr>
   </w:style>
   <w:style w:type="paragraph" w:styleId="3">
     <w:name w:val="List Number 3"/>
@@ -1894,25 +1832,30 @@
   </w:style>
   <w:style w:type="paragraph" w:styleId="af2">
     <w:name w:val="Title"/>
-    <w:basedOn w:val="a1"/>
-    <w:next w:val="a1"/>
-    <w:link w:val="af3"/>
-    <w:uiPriority w:val="10"/>
+    <w:basedOn w:val="a8"/>
+    <w:next w:val="a8"/>
+    <w:uiPriority w:val="2"/>
     <w:qFormat/>
     <w:pPr>
-      <w:pBdr>
-        <w:bottom w:val="single" w:sz="8" w:space="4" w:color="4F81BD" w:themeColor="accent1"/>
-      </w:pBdr>
-      <w:spacing w:after="300" w:line="240" w:lineRule="auto"/>
-      <w:contextualSpacing/>
+      <w:keepNext/>
+      <w:keepLines/>
+      <w:widowControl w:val="0"/>
+      <w:spacing w:before="0" w:after="0" w:line="579" w:lineRule="exact"/>
+      <w:ind w:left="0" w:right="0" w:firstLine="0"/>
+      <w:jc w:val="center"/>
+      <w:outlineLvl w:val="9"/>
     </w:pPr>
     <w:rPr>
-      <w:rFonts w:asciiTheme="majorHAnsi" w:eastAsiaTheme="majorEastAsia" w:hAnsiTheme="majorHAnsi" w:cstheme="majorBidi"/>
-      <w:color w:val="17365D" w:themeColor="text2" w:themeShade="BF"/>
-      <w:spacing w:val="5"/>
-      <w:kern w:val="28"/>
-      <w:sz w:val="52"/>
-      <w:szCs w:val="52"/>
+      <w:rFonts w:ascii="方正小标宋简体" w:hAnsi="方正小标宋简体" w:eastAsia="方正小标宋简体" w:cs="Times New Roman"/>
+      <w:b w:val="0"/>
+      <w:bCs w:val="0"/>
+      <w:i w:val="0"/>
+      <w:iCs w:val="0"/>
+      <w:color w:val="000000"/>
+      <w:spacing w:val="0"/>
+      <w:sz w:val="44"/>
+      <w:szCs w:val="44"/>
+      <w:lang w:val="en-US" w:eastAsia="zh-CN"/>
     </w:rPr>
   </w:style>
   <w:style w:type="table" w:styleId="af4">
@@ -11731,24 +11674,99 @@
   </w:style>
   <w:style w:type="paragraph" w:customStyle="1" w:styleId="aff4">
     <w:name w:val="信函标题"/>
-    <w:basedOn w:val="a1"/>
-    <w:rPr>
-      <w:rFonts w:ascii="方正小标宋简体" w:eastAsia="方正小标宋简体" w:hAnsi="方正小标宋简体"/>
-      <w:sz w:val="44"/>
-    </w:rPr>
+    <w:basedOn w:val="af2"/>
+    <w:next w:val="a8"/>
+    <w:uiPriority w:val="1"/>
+    <w:qFormat/>
   </w:style>
   <w:style w:type="paragraph" w:customStyle="1" w:styleId="aff5">
     <w:name w:val="正文一级标题"/>
-    <w:basedOn w:val="a1"/>
-    <w:rPr>
-      <w:rFonts w:ascii="SimHei" w:eastAsia="SimHei" w:hAnsi="SimHei"/>
-    </w:rPr>
+    <w:basedOn w:val="1"/>
+    <w:next w:val="a8"/>
+    <w:uiPriority w:val="1"/>
+    <w:qFormat/>
   </w:style>
   <w:style w:type="paragraph" w:customStyle="1" w:styleId="aff6">
     <w:name w:val="正文二级标题"/>
-    <w:basedOn w:val="a1"/>
+    <w:basedOn w:val="21"/>
+    <w:next w:val="a8"/>
+    <w:uiPriority w:val="1"/>
+    <w:qFormat/>
+  </w:style>
+  <w:style w:type="paragraph" w:customStyle="1" w:styleId="LetterheadAgency">
+    <w:name w:val="发文机关标志"/>
+    <w:basedOn w:val="a8"/>
+    <w:next w:val="a8"/>
+    <w:uiPriority w:val="1"/>
+    <w:qFormat/>
+    <w:pPr>
+      <w:keepNext/>
+      <w:keepLines/>
+      <w:widowControl w:val="0"/>
+      <w:spacing w:before="0" w:after="0" w:line="680" w:lineRule="exact"/>
+      <w:ind w:left="0" w:right="0" w:firstLine="0"/>
+      <w:jc w:val="center"/>
+      <w:outlineLvl w:val="9"/>
+    </w:pPr>
     <w:rPr>
-      <w:rFonts w:ascii="楷体" w:eastAsia="楷体" w:hAnsi="楷体"/>
+      <w:rFonts w:ascii="方正小标宋简体" w:hAnsi="方正小标宋简体" w:eastAsia="方正小标宋简体" w:cs="Times New Roman"/>
+      <w:b w:val="0"/>
+      <w:bCs w:val="0"/>
+      <w:i w:val="0"/>
+      <w:iCs w:val="0"/>
+      <w:color w:val="FF0000"/>
+      <w:spacing w:val="0"/>
+      <w:sz w:val="60"/>
+      <w:szCs w:val="60"/>
+      <w:lang w:val="en-US" w:eastAsia="zh-CN"/>
+    </w:rPr>
+  </w:style>
+  <w:style w:type="paragraph" w:customStyle="1" w:styleId="LetterCopyTo">
+    <w:name w:val="抄送"/>
+    <w:basedOn w:val="a8"/>
+    <w:next w:val="LetterCopyTo"/>
+    <w:uiPriority w:val="2"/>
+    <w:qFormat/>
+    <w:pPr>
+      <w:keepNext w:val="0"/>
+      <w:keepLines/>
+      <w:widowControl w:val="0"/>
+      <w:snapToGrid w:val="0"/>
+      <w:spacing w:before="0" w:after="0" w:line="579" w:lineRule="exact"/>
+      <w:ind w:left="1120" w:right="280" w:hanging="840"/>
+      <w:jc w:val="left"/>
+      <w:outlineLvl w:val="9"/>
+    </w:pPr>
+    <w:rPr>
+      <w:rFonts w:ascii="Times New Roman" w:hAnsi="Times New Roman" w:eastAsia="仿宋" w:cs="Times New Roman"/>
+      <w:b w:val="0"/>
+      <w:bCs w:val="0"/>
+      <w:i w:val="0"/>
+      <w:iCs w:val="0"/>
+      <w:color w:val="000000"/>
+      <w:spacing w:val="0"/>
+      <w:sz w:val="28"/>
+      <w:szCs w:val="28"/>
+    </w:rPr>
+  </w:style>
+  <w:style w:type="paragraph" w:customStyle="1" w:styleId="LetterEndAnchor">
+    <w:name w:val="末页定位锚点"/>
+    <w:basedOn w:val="a8"/>
+    <w:next w:val="a8"/>
+    <w:semiHidden/>
+    <w:pPr>
+      <w:keepNext w:val="0"/>
+      <w:keepLines/>
+      <w:widowControl w:val="0"/>
+      <w:snapToGrid w:val="0"/>
+      <w:spacing w:before="0" w:after="0" w:line="20" w:lineRule="exact"/>
+      <w:ind w:left="0" w:right="0" w:firstLine="0"/>
+      <w:jc w:val="left"/>
+      <w:outlineLvl w:val="9"/>
+    </w:pPr>
+    <w:rPr>
+      <w:sz w:val="2"/>
+      <w:szCs w:val="2"/>
     </w:rPr>
   </w:style>
 </w:styles>

</xml_diff>